<commit_message>
Update Word documents (link + QR code)
</commit_message>
<xml_diff>
--- a/docs/Dossier_SIPDMS_CAY_TleC.docx
+++ b/docs/Dossier_SIPDMS_CAY_TleC.docx
@@ -66,7 +66,31 @@
           <w:sz w:val="19"/>
           <w:szCs w:val="19"/>
         </w:rPr>
-        <w:t>DOSSIER DE PROJET  ·  INTELLIGENCE ARTIFICIELLE ET PRÉVENTION</w:t>
+        <w:t xml:space="preserve">DOSSIER DE </w:t>
+      </w:r>
+      <w:proofErr w:type="gramStart"/>
+      <w:r>
+        <w:rPr>
+          <w:b/>
+          <w:bCs/>
+          <w:color w:val="14B8D4"/>
+          <w:spacing w:val="30"/>
+          <w:sz w:val="19"/>
+          <w:szCs w:val="19"/>
+        </w:rPr>
+        <w:t>PROJET  ·</w:t>
+      </w:r>
+      <w:proofErr w:type="gramEnd"/>
+      <w:r>
+        <w:rPr>
+          <w:b/>
+          <w:bCs/>
+          <w:color w:val="14B8D4"/>
+          <w:spacing w:val="30"/>
+          <w:sz w:val="19"/>
+          <w:szCs w:val="19"/>
+        </w:rPr>
+        <w:t xml:space="preserve">  INTELLIGENCE ARTIFICIELLE ET PRÉVENTION</w:t>
       </w:r>
     </w:p>
     <w:p>
@@ -143,10 +167,10 @@
                                 <w:noProof/>
                               </w:rPr>
                               <w:drawing>
-                                <wp:inline distT="0" distB="0" distL="0" distR="0" wp14:anchorId="7C5EAA1D" wp14:editId="43D7360A">
-                                  <wp:extent cx="2006600" cy="2045569"/>
+                                <wp:inline distT="0" distB="0" distL="0" distR="0" wp14:anchorId="69CC5103" wp14:editId="37830809">
+                                  <wp:extent cx="2025650" cy="2025650"/>
                                   <wp:effectExtent l="0" t="0" r="0" b="0"/>
-                                  <wp:docPr id="908270917" name="Image 1"/>
+                                  <wp:docPr id="57469820" name="Image 3"/>
                                   <wp:cNvGraphicFramePr>
                                     <a:graphicFrameLocks xmlns:a="http://schemas.openxmlformats.org/drawingml/2006/main" noChangeAspect="1"/>
                                   </wp:cNvGraphicFramePr>
@@ -154,23 +178,36 @@
                                     <a:graphicData uri="http://schemas.openxmlformats.org/drawingml/2006/picture">
                                       <pic:pic xmlns:pic="http://schemas.openxmlformats.org/drawingml/2006/picture">
                                         <pic:nvPicPr>
-                                          <pic:cNvPr id="908270917" name=""/>
-                                          <pic:cNvPicPr/>
+                                          <pic:cNvPr id="0" name="Picture 1"/>
+                                          <pic:cNvPicPr>
+                                            <a:picLocks noChangeAspect="1" noChangeArrowheads="1"/>
+                                          </pic:cNvPicPr>
                                         </pic:nvPicPr>
                                         <pic:blipFill>
-                                          <a:blip r:embed="rId8"/>
+                                          <a:blip r:embed="rId8">
+                                            <a:extLst>
+                                              <a:ext uri="{28A0092B-C50C-407E-A947-70E740481C1C}">
+                                                <a14:useLocalDpi xmlns:a14="http://schemas.microsoft.com/office/drawing/2010/main" val="0"/>
+                                              </a:ext>
+                                            </a:extLst>
+                                          </a:blip>
+                                          <a:srcRect/>
                                           <a:stretch>
                                             <a:fillRect/>
                                           </a:stretch>
                                         </pic:blipFill>
-                                        <pic:spPr>
+                                        <pic:spPr bwMode="auto">
                                           <a:xfrm>
                                             <a:off x="0" y="0"/>
-                                            <a:ext cx="2025376" cy="2064709"/>
+                                            <a:ext cx="2025650" cy="2025650"/>
                                           </a:xfrm>
                                           <a:prstGeom prst="rect">
                                             <a:avLst/>
                                           </a:prstGeom>
+                                          <a:noFill/>
+                                          <a:ln>
+                                            <a:noFill/>
+                                          </a:ln>
                                         </pic:spPr>
                                       </pic:pic>
                                     </a:graphicData>
@@ -211,10 +248,10 @@
                           <w:noProof/>
                         </w:rPr>
                         <w:drawing>
-                          <wp:inline distT="0" distB="0" distL="0" distR="0" wp14:anchorId="7C5EAA1D" wp14:editId="43D7360A">
-                            <wp:extent cx="2006600" cy="2045569"/>
+                          <wp:inline distT="0" distB="0" distL="0" distR="0" wp14:anchorId="69CC5103" wp14:editId="37830809">
+                            <wp:extent cx="2025650" cy="2025650"/>
                             <wp:effectExtent l="0" t="0" r="0" b="0"/>
-                            <wp:docPr id="908270917" name="Image 1"/>
+                            <wp:docPr id="57469820" name="Image 3"/>
                             <wp:cNvGraphicFramePr>
                               <a:graphicFrameLocks xmlns:a="http://schemas.openxmlformats.org/drawingml/2006/main" noChangeAspect="1"/>
                             </wp:cNvGraphicFramePr>
@@ -222,23 +259,36 @@
                               <a:graphicData uri="http://schemas.openxmlformats.org/drawingml/2006/picture">
                                 <pic:pic xmlns:pic="http://schemas.openxmlformats.org/drawingml/2006/picture">
                                   <pic:nvPicPr>
-                                    <pic:cNvPr id="908270917" name=""/>
-                                    <pic:cNvPicPr/>
+                                    <pic:cNvPr id="0" name="Picture 1"/>
+                                    <pic:cNvPicPr>
+                                      <a:picLocks noChangeAspect="1" noChangeArrowheads="1"/>
+                                    </pic:cNvPicPr>
                                   </pic:nvPicPr>
                                   <pic:blipFill>
-                                    <a:blip r:embed="rId8"/>
+                                    <a:blip r:embed="rId8">
+                                      <a:extLst>
+                                        <a:ext uri="{28A0092B-C50C-407E-A947-70E740481C1C}">
+                                          <a14:useLocalDpi xmlns:a14="http://schemas.microsoft.com/office/drawing/2010/main" val="0"/>
+                                        </a:ext>
+                                      </a:extLst>
+                                    </a:blip>
+                                    <a:srcRect/>
                                     <a:stretch>
                                       <a:fillRect/>
                                     </a:stretch>
                                   </pic:blipFill>
-                                  <pic:spPr>
+                                  <pic:spPr bwMode="auto">
                                     <a:xfrm>
                                       <a:off x="0" y="0"/>
-                                      <a:ext cx="2025376" cy="2064709"/>
+                                      <a:ext cx="2025650" cy="2025650"/>
                                     </a:xfrm>
                                     <a:prstGeom prst="rect">
                                       <a:avLst/>
                                     </a:prstGeom>
+                                    <a:noFill/>
+                                    <a:ln>
+                                      <a:noFill/>
+                                    </a:ln>
                                   </pic:spPr>
                                 </pic:pic>
                               </a:graphicData>
@@ -282,6 +332,7 @@
       <w:pPr>
         <w:spacing w:after="240"/>
       </w:pPr>
+      <w:proofErr w:type="gramStart"/>
       <w:r>
         <w:rPr>
           <w:b/>
@@ -290,7 +341,18 @@
           <w:sz w:val="36"/>
           <w:szCs w:val="36"/>
         </w:rPr>
-        <w:t>de la Délinquance en Milieu Scolaire</w:t>
+        <w:t>de</w:t>
+      </w:r>
+      <w:proofErr w:type="gramEnd"/>
+      <w:r>
+        <w:rPr>
+          <w:b/>
+          <w:bCs/>
+          <w:color w:val="D4A93C"/>
+          <w:sz w:val="36"/>
+          <w:szCs w:val="36"/>
+        </w:rPr>
+        <w:t xml:space="preserve"> la Délinquance en Milieu Scolaire</w:t>
       </w:r>
     </w:p>
     <w:p>
@@ -321,15 +383,15 @@
         <mc:AlternateContent>
           <mc:Choice Requires="wps">
             <w:drawing>
-              <wp:anchor distT="45720" distB="45720" distL="114300" distR="114300" simplePos="0" relativeHeight="251661312" behindDoc="0" locked="0" layoutInCell="1" allowOverlap="1" wp14:anchorId="20DDC234" wp14:editId="04D2AEF6">
+              <wp:anchor distT="45720" distB="45720" distL="114300" distR="114300" simplePos="0" relativeHeight="251661312" behindDoc="0" locked="0" layoutInCell="1" allowOverlap="1" wp14:anchorId="20DDC234" wp14:editId="363BBD99">
                 <wp:simplePos x="0" y="0"/>
-                <wp:positionH relativeFrom="page">
-                  <wp:posOffset>4699000</wp:posOffset>
+                <wp:positionH relativeFrom="margin">
+                  <wp:posOffset>4132580</wp:posOffset>
                 </wp:positionH>
                 <wp:positionV relativeFrom="paragraph">
-                  <wp:posOffset>66040</wp:posOffset>
+                  <wp:posOffset>59690</wp:posOffset>
                 </wp:positionV>
-                <wp:extent cx="2432050" cy="400050"/>
+                <wp:extent cx="2139950" cy="400050"/>
                 <wp:effectExtent l="0" t="0" r="0" b="0"/>
                 <wp:wrapSquare wrapText="bothSides"/>
                 <wp:docPr id="720842866" name="Zone de texte 2"/>
@@ -345,7 +407,7 @@
                       <wps:spPr bwMode="auto">
                         <a:xfrm>
                           <a:off x="0" y="0"/>
-                          <a:ext cx="2432050" cy="400050"/>
+                          <a:ext cx="2139950" cy="400050"/>
                         </a:xfrm>
                         <a:prstGeom prst="rect">
                           <a:avLst/>
@@ -372,11 +434,8 @@
                               <w:r>
                                 <w:rPr>
                                   <w:rStyle w:val="Lienhypertexte"/>
-                                  <w:color w:val="FFFFFF" w:themeColor="background1"/>
-                                  <w:sz w:val="18"/>
-                                  <w:szCs w:val="18"/>
                                 </w:rPr>
-                                <w:t>https://jt-web-create.github.io/sipdms-dossier/</w:t>
+                                <w:t>https://sipdms-dossier.netlify.app/</w:t>
                               </w:r>
                             </w:hyperlink>
                           </w:p>
@@ -399,7 +458,7 @@
           </mc:Choice>
           <mc:Fallback>
             <w:pict>
-              <v:shape w14:anchorId="20DDC234" id="_x0000_s1027" type="#_x0000_t202" style="position:absolute;margin-left:370pt;margin-top:5.2pt;width:191.5pt;height:31.5pt;z-index:251661312;visibility:visible;mso-wrap-style:square;mso-width-percent:0;mso-height-percent:0;mso-wrap-distance-left:9pt;mso-wrap-distance-top:3.6pt;mso-wrap-distance-right:9pt;mso-wrap-distance-bottom:3.6pt;mso-position-horizontal:absolute;mso-position-horizontal-relative:page;mso-position-vertical:absolute;mso-position-vertical-relative:text;mso-width-percent:0;mso-height-percent:0;mso-width-relative:margin;mso-height-relative:margin;v-text-anchor:top" o:gfxdata="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" filled="f" stroked="f">
+              <v:shape w14:anchorId="20DDC234" id="_x0000_s1027" type="#_x0000_t202" style="position:absolute;margin-left:325.4pt;margin-top:4.7pt;width:168.5pt;height:31.5pt;z-index:251661312;visibility:visible;mso-wrap-style:square;mso-width-percent:0;mso-height-percent:0;mso-wrap-distance-left:9pt;mso-wrap-distance-top:3.6pt;mso-wrap-distance-right:9pt;mso-wrap-distance-bottom:3.6pt;mso-position-horizontal:absolute;mso-position-horizontal-relative:margin;mso-position-vertical:absolute;mso-position-vertical-relative:text;mso-width-percent:0;mso-height-percent:0;mso-width-relative:margin;mso-height-relative:margin;v-text-anchor:top" o:gfxdata="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" filled="f" stroked="f">
                 <v:textbox>
                   <w:txbxContent>
                     <w:p>
@@ -414,22 +473,20 @@
                         <w:r>
                           <w:rPr>
                             <w:rStyle w:val="Lienhypertexte"/>
-                            <w:color w:val="FFFFFF" w:themeColor="background1"/>
-                            <w:sz w:val="18"/>
-                            <w:szCs w:val="18"/>
                           </w:rPr>
-                          <w:t>https://jt-web-create.github.io/sipdms-dossier/</w:t>
+                          <w:t>https://sipdms-dossier.netlify.app/</w:t>
                         </w:r>
                       </w:hyperlink>
                     </w:p>
                   </w:txbxContent>
                 </v:textbox>
-                <w10:wrap type="square" anchorx="page"/>
+                <w10:wrap type="square" anchorx="margin"/>
               </v:shape>
             </w:pict>
           </mc:Fallback>
         </mc:AlternateContent>
       </w:r>
+      <w:proofErr w:type="gramStart"/>
       <w:r>
         <w:rPr>
           <w:i/>
@@ -438,7 +495,18 @@
           <w:sz w:val="26"/>
           <w:szCs w:val="26"/>
         </w:rPr>
-        <w:t>pour permettre une intervention humaine plus précoce.</w:t>
+        <w:t>pour</w:t>
+      </w:r>
+      <w:proofErr w:type="gramEnd"/>
+      <w:r>
+        <w:rPr>
+          <w:i/>
+          <w:iCs/>
+          <w:color w:val="CFF4FA"/>
+          <w:sz w:val="26"/>
+          <w:szCs w:val="26"/>
+        </w:rPr>
+        <w:t xml:space="preserve"> permettre une intervention humaine plus précoce.</w:t>
       </w:r>
     </w:p>
     <w:p>
@@ -469,7 +537,25 @@
           <w:sz w:val="24"/>
           <w:szCs w:val="24"/>
         </w:rPr>
-        <w:t>Classe de Terminale C  ·  Année scolaire 2026–2027</w:t>
+        <w:t xml:space="preserve">Classe de Terminale </w:t>
+      </w:r>
+      <w:proofErr w:type="gramStart"/>
+      <w:r>
+        <w:rPr>
+          <w:color w:val="CFF4FA"/>
+          <w:sz w:val="24"/>
+          <w:szCs w:val="24"/>
+        </w:rPr>
+        <w:t>C  ·</w:t>
+      </w:r>
+      <w:proofErr w:type="gramEnd"/>
+      <w:r>
+        <w:rPr>
+          <w:color w:val="CFF4FA"/>
+          <w:sz w:val="24"/>
+          <w:szCs w:val="24"/>
+        </w:rPr>
+        <w:t xml:space="preserve">  Année scolaire 2026–2027</w:t>
       </w:r>
     </w:p>
     <w:p>
@@ -492,7 +578,71 @@
           <w:sz w:val="20"/>
           <w:szCs w:val="20"/>
         </w:rPr>
-        <w:t>Bohol, See , Djeugoué, Adzengue, Ntiam</w:t>
+        <w:t xml:space="preserve">Bohol, </w:t>
+      </w:r>
+      <w:proofErr w:type="spellStart"/>
+      <w:proofErr w:type="gramStart"/>
+      <w:r>
+        <w:rPr>
+          <w:color w:val="B8C7DD"/>
+          <w:sz w:val="20"/>
+          <w:szCs w:val="20"/>
+        </w:rPr>
+        <w:t>See</w:t>
+      </w:r>
+      <w:proofErr w:type="spellEnd"/>
+      <w:r>
+        <w:rPr>
+          <w:color w:val="B8C7DD"/>
+          <w:sz w:val="20"/>
+          <w:szCs w:val="20"/>
+        </w:rPr>
+        <w:t> ,</w:t>
+      </w:r>
+      <w:proofErr w:type="gramEnd"/>
+      <w:r>
+        <w:rPr>
+          <w:color w:val="B8C7DD"/>
+          <w:sz w:val="20"/>
+          <w:szCs w:val="20"/>
+        </w:rPr>
+        <w:t xml:space="preserve"> </w:t>
+      </w:r>
+      <w:proofErr w:type="spellStart"/>
+      <w:r>
+        <w:rPr>
+          <w:color w:val="B8C7DD"/>
+          <w:sz w:val="20"/>
+          <w:szCs w:val="20"/>
+        </w:rPr>
+        <w:t>Djeugoué</w:t>
+      </w:r>
+      <w:proofErr w:type="spellEnd"/>
+      <w:r>
+        <w:rPr>
+          <w:color w:val="B8C7DD"/>
+          <w:sz w:val="20"/>
+          <w:szCs w:val="20"/>
+        </w:rPr>
+        <w:t xml:space="preserve">, </w:t>
+      </w:r>
+      <w:proofErr w:type="spellStart"/>
+      <w:r>
+        <w:rPr>
+          <w:color w:val="B8C7DD"/>
+          <w:sz w:val="20"/>
+          <w:szCs w:val="20"/>
+        </w:rPr>
+        <w:t>Adzengue</w:t>
+      </w:r>
+      <w:proofErr w:type="spellEnd"/>
+      <w:r>
+        <w:rPr>
+          <w:color w:val="B8C7DD"/>
+          <w:sz w:val="20"/>
+          <w:szCs w:val="20"/>
+        </w:rPr>
+        <w:t>, Ntiam</w:t>
       </w:r>
     </w:p>
     <w:p>
@@ -667,13 +817,23 @@
             <w:pPr>
               <w:spacing w:line="250" w:lineRule="auto"/>
             </w:pPr>
+            <w:proofErr w:type="gramStart"/>
             <w:r>
               <w:rPr>
                 <w:color w:val="DDE8F7"/>
                 <w:sz w:val="18"/>
                 <w:szCs w:val="18"/>
               </w:rPr>
-              <w:t>élèves victimes de harcèlement par leurs pairs sur un mois, au niveau mondial (UNESCO, 2019)</w:t>
+              <w:t>élèves</w:t>
+            </w:r>
+            <w:proofErr w:type="gramEnd"/>
+            <w:r>
+              <w:rPr>
+                <w:color w:val="DDE8F7"/>
+                <w:sz w:val="18"/>
+                <w:szCs w:val="18"/>
+              </w:rPr>
+              <w:t xml:space="preserve"> victimes de harcèlement par leurs pairs sur un mois, au niveau mondial (UNESCO, 2019)</w:t>
             </w:r>
           </w:p>
         </w:tc>
@@ -714,13 +874,23 @@
             <w:pPr>
               <w:spacing w:line="250" w:lineRule="auto"/>
             </w:pPr>
+            <w:proofErr w:type="gramStart"/>
             <w:r>
               <w:rPr>
                 <w:color w:val="DDE8F7"/>
                 <w:sz w:val="18"/>
                 <w:szCs w:val="18"/>
               </w:rPr>
-              <w:t>situations de vérité connue injectées dans un lycée simulé, évaluées sur 30 simulations (données synthétiques)</w:t>
+              <w:t>situations</w:t>
+            </w:r>
+            <w:proofErr w:type="gramEnd"/>
+            <w:r>
+              <w:rPr>
+                <w:color w:val="DDE8F7"/>
+                <w:sz w:val="18"/>
+                <w:szCs w:val="18"/>
+              </w:rPr>
+              <w:t xml:space="preserve"> de vérité connue injectées dans un lycée simulé, évaluées sur 30 simulations (données synthétiques)</w:t>
             </w:r>
           </w:p>
         </w:tc>
@@ -761,13 +931,23 @@
             <w:pPr>
               <w:spacing w:line="250" w:lineRule="auto"/>
             </w:pPr>
+            <w:proofErr w:type="gramStart"/>
             <w:r>
               <w:rPr>
                 <w:color w:val="DDE8F7"/>
                 <w:sz w:val="18"/>
                 <w:szCs w:val="18"/>
               </w:rPr>
-              <w:t>individuel, 0 sanction automatique : l'humain décide toujours</w:t>
+              <w:t>individuel</w:t>
+            </w:r>
+            <w:proofErr w:type="gramEnd"/>
+            <w:r>
+              <w:rPr>
+                <w:color w:val="DDE8F7"/>
+                <w:sz w:val="18"/>
+                <w:szCs w:val="18"/>
+              </w:rPr>
+              <w:t>, 0 sanction automatique : l'humain décide toujours</w:t>
             </w:r>
           </w:p>
         </w:tc>
@@ -2307,7 +2487,15 @@
           <w:t>Figure 10</w:t>
         </w:r>
         <w:r>
-          <w:t xml:space="preserve"> — La boucle de retour : l'humain qualifie l'alerte, le système se calibre.</w:t>
+          <w:t xml:space="preserve"> — La boucle de retour : l'humain qualifie l'alerte, le système </w:t>
+        </w:r>
+        <w:proofErr w:type="spellStart"/>
+        <w:r>
+          <w:t>se</w:t>
+        </w:r>
+        <w:proofErr w:type="spellEnd"/>
+        <w:r>
+          <w:t xml:space="preserve"> calibre.</w:t>
         </w:r>
         <w:r>
           <w:tab/>
@@ -2459,7 +2647,15 @@
           <w:t>Figure 14</w:t>
         </w:r>
         <w:r>
-          <w:t xml:space="preserve"> — La règle du pass : un seuil de durée, un retour enregistré annule tout signal.</w:t>
+          <w:t xml:space="preserve"> — La règle du </w:t>
+        </w:r>
+        <w:proofErr w:type="spellStart"/>
+        <w:r>
+          <w:t>pass</w:t>
+        </w:r>
+        <w:proofErr w:type="spellEnd"/>
+        <w:r>
+          <w:t xml:space="preserve"> : un seuil de durée, un retour enregistré annule tout signal.</w:t>
         </w:r>
         <w:r>
           <w:tab/>
@@ -2829,6 +3025,7 @@
         <w:pageBreakBefore/>
       </w:pPr>
       <w:bookmarkStart w:id="1" w:name="toc2"/>
+      <w:proofErr w:type="gramStart"/>
       <w:r>
         <w:rPr>
           <w:color w:val="D4A93C"/>
@@ -2837,7 +3034,11 @@
         <w:t xml:space="preserve">1  </w:t>
       </w:r>
       <w:r>
-        <w:t>Introduction : un établissement sûr pour apprendre</w:t>
+        <w:t>Introduction</w:t>
+      </w:r>
+      <w:proofErr w:type="gramEnd"/>
+      <w:r>
+        <w:t xml:space="preserve"> : un établissement sûr pour apprendre</w:t>
       </w:r>
       <w:bookmarkEnd w:id="1"/>
     </w:p>
@@ -2960,7 +3161,23 @@
         <w:t>aucune statistique nationale comparable</w:t>
       </w:r>
       <w:r>
-        <w:t xml:space="preserve"> sur le harcèlement entre élèves. Des analyses documentaires récentes décrivent pourtant des violences persistantes et des obstacles au signalement (European Scientific Journal, 2025), et la presse rapporte régulièrement des incidents graves (Cameroon Tribune, 2022). Ce manque de données est un enseignement en soi : </w:t>
+        <w:t xml:space="preserve"> sur le harcèlement entre élèves. Des analyses documentaires récentes décrivent pourtant des violences persistantes et des obstacles au signalement (</w:t>
+      </w:r>
+      <w:proofErr w:type="spellStart"/>
+      <w:r>
+        <w:t>European</w:t>
+      </w:r>
+      <w:proofErr w:type="spellEnd"/>
+      <w:r>
+        <w:t xml:space="preserve"> Scientific Journal, 2025), et la presse rapporte régulièrement des incidents graves (</w:t>
+      </w:r>
+      <w:proofErr w:type="spellStart"/>
+      <w:r>
+        <w:t>Cameroon</w:t>
+      </w:r>
+      <w:proofErr w:type="spellEnd"/>
+      <w:r>
+        <w:t xml:space="preserve"> Tribune, 2022). Ce manque de données est un enseignement en soi : </w:t>
       </w:r>
       <w:r>
         <w:rPr>
@@ -3089,6 +3306,7 @@
         <w:pageBreakBefore/>
       </w:pPr>
       <w:bookmarkStart w:id="3" w:name="toc3"/>
+      <w:proofErr w:type="gramStart"/>
       <w:r>
         <w:rPr>
           <w:color w:val="D4A93C"/>
@@ -3097,7 +3315,11 @@
         <w:t xml:space="preserve">2  </w:t>
       </w:r>
       <w:r>
-        <w:t>Le problème : comprendre la délinquance scolaire</w:t>
+        <w:t>Le</w:t>
+      </w:r>
+      <w:proofErr w:type="gramEnd"/>
+      <w:r>
+        <w:t xml:space="preserve"> problème : comprendre la délinquance scolaire</w:t>
       </w:r>
       <w:bookmarkEnd w:id="3"/>
     </w:p>
@@ -3129,12 +3351,21 @@
         </w:numPr>
         <w:spacing w:after="70" w:line="280" w:lineRule="auto"/>
       </w:pPr>
-      <w:r>
-        <w:rPr>
-          <w:b/>
-          <w:bCs/>
-        </w:rPr>
-        <w:t>violences physiques</w:t>
+      <w:proofErr w:type="gramStart"/>
+      <w:r>
+        <w:rPr>
+          <w:b/>
+          <w:bCs/>
+        </w:rPr>
+        <w:t>violences</w:t>
+      </w:r>
+      <w:proofErr w:type="gramEnd"/>
+      <w:r>
+        <w:rPr>
+          <w:b/>
+          <w:bCs/>
+        </w:rPr>
+        <w:t xml:space="preserve"> physiques</w:t>
       </w:r>
       <w:r>
         <w:t>, menaces et agressions ;</w:t>
@@ -3149,6 +3380,7 @@
         </w:numPr>
         <w:spacing w:after="70" w:line="280" w:lineRule="auto"/>
       </w:pPr>
+      <w:proofErr w:type="gramStart"/>
       <w:r>
         <w:rPr>
           <w:b/>
@@ -3156,6 +3388,7 @@
         </w:rPr>
         <w:t>harcèlement</w:t>
       </w:r>
+      <w:proofErr w:type="gramEnd"/>
       <w:r>
         <w:t>, y compris répété et verbal ;</w:t>
       </w:r>
@@ -3169,6 +3402,7 @@
         </w:numPr>
         <w:spacing w:after="70" w:line="280" w:lineRule="auto"/>
       </w:pPr>
+      <w:proofErr w:type="gramStart"/>
       <w:r>
         <w:rPr>
           <w:b/>
@@ -3176,6 +3410,7 @@
         </w:rPr>
         <w:t>racket</w:t>
       </w:r>
+      <w:proofErr w:type="gramEnd"/>
       <w:r>
         <w:t xml:space="preserve"> et extorsion ;</w:t>
       </w:r>
@@ -3189,6 +3424,7 @@
         </w:numPr>
         <w:spacing w:after="70" w:line="280" w:lineRule="auto"/>
       </w:pPr>
+      <w:proofErr w:type="gramStart"/>
       <w:r>
         <w:rPr>
           <w:b/>
@@ -3196,6 +3432,7 @@
         </w:rPr>
         <w:t>vols</w:t>
       </w:r>
+      <w:proofErr w:type="gramEnd"/>
       <w:r>
         <w:t xml:space="preserve">, </w:t>
       </w:r>
@@ -3219,6 +3456,7 @@
         </w:numPr>
         <w:spacing w:after="70" w:line="280" w:lineRule="auto"/>
       </w:pPr>
+      <w:proofErr w:type="gramStart"/>
       <w:r>
         <w:rPr>
           <w:b/>
@@ -3226,6 +3464,7 @@
         </w:rPr>
         <w:t>intrusion</w:t>
       </w:r>
+      <w:proofErr w:type="gramEnd"/>
       <w:r>
         <w:t xml:space="preserve"> dans l'établissement ;</w:t>
       </w:r>
@@ -3239,8 +3478,13 @@
         </w:numPr>
         <w:spacing w:after="140" w:line="280" w:lineRule="auto"/>
       </w:pPr>
-      <w:r>
-        <w:t xml:space="preserve">circulation de </w:t>
+      <w:proofErr w:type="gramStart"/>
+      <w:r>
+        <w:t>circulation</w:t>
+      </w:r>
+      <w:proofErr w:type="gramEnd"/>
+      <w:r>
+        <w:t xml:space="preserve"> de </w:t>
       </w:r>
       <w:r>
         <w:rPr>
@@ -3407,6 +3651,7 @@
         <w:pageBreakBefore/>
       </w:pPr>
       <w:bookmarkStart w:id="7" w:name="toc6"/>
+      <w:proofErr w:type="gramStart"/>
       <w:r>
         <w:rPr>
           <w:color w:val="D4A93C"/>
@@ -3415,7 +3660,11 @@
         <w:t xml:space="preserve">3  </w:t>
       </w:r>
       <w:r>
-        <w:t>Délinquance ≠ simple infraction au règlement</w:t>
+        <w:t>Délinquance</w:t>
+      </w:r>
+      <w:proofErr w:type="gramEnd"/>
+      <w:r>
+        <w:t xml:space="preserve"> ≠ simple infraction au règlement</w:t>
       </w:r>
       <w:bookmarkEnd w:id="7"/>
     </w:p>
@@ -3530,7 +3779,15 @@
         <w:spacing w:after="130"/>
       </w:pPr>
       <w:r>
-        <w:t xml:space="preserve">Entre les deux existe une zone intermédiaire : les </w:t>
+        <w:t xml:space="preserve">Entre les deux </w:t>
+      </w:r>
+      <w:proofErr w:type="gramStart"/>
+      <w:r>
+        <w:t>existe</w:t>
+      </w:r>
+      <w:proofErr w:type="gramEnd"/>
+      <w:r>
+        <w:t xml:space="preserve"> une zone intermédiaire : les </w:t>
       </w:r>
       <w:r>
         <w:rPr>
@@ -3636,6 +3893,7 @@
         <w:pageBreakBefore/>
       </w:pPr>
       <w:bookmarkStart w:id="9" w:name="toc7"/>
+      <w:proofErr w:type="gramStart"/>
       <w:r>
         <w:rPr>
           <w:color w:val="D4A93C"/>
@@ -3644,7 +3902,11 @@
         <w:t xml:space="preserve">4  </w:t>
       </w:r>
       <w:r>
-        <w:t>Pourquoi les approches classiques montrent leurs limites</w:t>
+        <w:t>Pourquoi</w:t>
+      </w:r>
+      <w:proofErr w:type="gramEnd"/>
+      <w:r>
+        <w:t xml:space="preserve"> les approches classiques montrent leurs limites</w:t>
       </w:r>
       <w:bookmarkEnd w:id="9"/>
     </w:p>
@@ -3872,6 +4134,7 @@
         <w:pageBreakBefore/>
       </w:pPr>
       <w:bookmarkStart w:id="11" w:name="toc8"/>
+      <w:proofErr w:type="gramStart"/>
       <w:r>
         <w:rPr>
           <w:color w:val="D4A93C"/>
@@ -3880,7 +4143,11 @@
         <w:t xml:space="preserve">5  </w:t>
       </w:r>
       <w:r>
-        <w:t>La vision SIPDMS : observer, comprendre, relier, prévenir</w:t>
+        <w:t>La</w:t>
+      </w:r>
+      <w:proofErr w:type="gramEnd"/>
+      <w:r>
+        <w:t xml:space="preserve"> vision SIPDMS : observer, comprendre, relier, prévenir</w:t>
       </w:r>
       <w:bookmarkEnd w:id="11"/>
     </w:p>
@@ -4413,6 +4680,7 @@
         <w:pageBreakBefore/>
       </w:pPr>
       <w:bookmarkStart w:id="16" w:name="toc11"/>
+      <w:proofErr w:type="gramStart"/>
       <w:r>
         <w:rPr>
           <w:color w:val="D4A93C"/>
@@ -4421,7 +4689,11 @@
         <w:t xml:space="preserve">6  </w:t>
       </w:r>
       <w:r>
-        <w:t>Où intervient réellement l'IA ?</w:t>
+        <w:t>Où</w:t>
+      </w:r>
+      <w:proofErr w:type="gramEnd"/>
+      <w:r>
+        <w:t xml:space="preserve"> intervient réellement l'IA ?</w:t>
       </w:r>
       <w:bookmarkEnd w:id="16"/>
     </w:p>
@@ -4533,7 +4805,15 @@
         <w:t>Moteur de règles (sans IA).</w:t>
       </w:r>
       <w:r>
-        <w:t xml:space="preserve"> Un pass de sortie trop long, un mot d'urgence, un seuil dépassé : ce sont des règles explicites, vérifiables et prévisibles. Un système intelligent n'a pas besoin de mettre de l'IA partout.</w:t>
+        <w:t xml:space="preserve"> Un </w:t>
+      </w:r>
+      <w:proofErr w:type="spellStart"/>
+      <w:r>
+        <w:t>pass</w:t>
+      </w:r>
+      <w:proofErr w:type="spellEnd"/>
+      <w:r>
+        <w:t xml:space="preserve"> de sortie trop long, un mot d'urgence, un seuil dépassé : ce sont des règles explicites, vérifiables et prévisibles. Un système intelligent n'a pas besoin de mettre de l'IA partout.</w:t>
       </w:r>
     </w:p>
     <w:p>
@@ -4565,6 +4845,7 @@
       <w:r>
         <w:t xml:space="preserve"> Un </w:t>
       </w:r>
+      <w:proofErr w:type="spellStart"/>
       <w:r>
         <w:rPr>
           <w:i/>
@@ -4572,8 +4853,17 @@
         </w:rPr>
         <w:t>embedding</w:t>
       </w:r>
-      <w:r>
-        <w:t xml:space="preserve"> transforme une phrase en une suite de nombres de sorte que deux phrases de sens proche donnent des suites proches. Cela permet de rapprocher « On m'insulte souvent près du bâtiment B » et « Ils recommencent encore à la sortie », sans mot en commun. Des modèles multilingues pré-entraînés (Reimers et Gurevych, 2019 ; 2020) existent et évitent d'entraîner un modèle complet.</w:t>
+      <w:proofErr w:type="spellEnd"/>
+      <w:r>
+        <w:t xml:space="preserve"> transforme une phrase en une suite de nombres de sorte que deux phrases de sens proche donnent des suites proches. Cela permet de rapprocher « On m'insulte souvent près du bâtiment B » et « Ils recommencent encore à la sortie », sans mot en commun. Des modèles multilingues pré-entraînés (Reimers et </w:t>
+      </w:r>
+      <w:proofErr w:type="spellStart"/>
+      <w:r>
+        <w:t>Gurevych</w:t>
+      </w:r>
+      <w:proofErr w:type="spellEnd"/>
+      <w:r>
+        <w:t>, 2019 ; 2020) existent et évitent d'entraîner un modèle complet.</w:t>
       </w:r>
     </w:p>
     <w:p>
@@ -4588,7 +4878,15 @@
         <w:t>Analyse temporelle et spatiale.</w:t>
       </w:r>
       <w:r>
-        <w:t xml:space="preserve"> Répétitions, fréquences, créneaux, zones. La recherche en criminologie montre que les incidents se concentrent souvent dans un petit nombre de lieux (Weisburd, 2015). Nous traitons cela comme une </w:t>
+        <w:t xml:space="preserve"> Répétitions, fréquences, créneaux, zones. La recherche en criminologie montre que les incidents se concentrent souvent dans un petit nombre de lieux (</w:t>
+      </w:r>
+      <w:proofErr w:type="spellStart"/>
+      <w:r>
+        <w:t>Weisburd</w:t>
+      </w:r>
+      <w:proofErr w:type="spellEnd"/>
+      <w:r>
+        <w:t xml:space="preserve">, 2015). Nous traitons cela comme une </w:t>
       </w:r>
       <w:r>
         <w:rPr>
@@ -4665,6 +4963,7 @@
         <w:pStyle w:val="Titre1"/>
       </w:pPr>
       <w:bookmarkStart w:id="20" w:name="toc14"/>
+      <w:proofErr w:type="gramStart"/>
       <w:r>
         <w:rPr>
           <w:color w:val="D4A93C"/>
@@ -4672,7 +4971,11 @@
         <w:t xml:space="preserve">7  </w:t>
       </w:r>
       <w:r>
-        <w:t>Architecture générale</w:t>
+        <w:t>Architecture</w:t>
+      </w:r>
+      <w:proofErr w:type="gramEnd"/>
+      <w:r>
+        <w:t xml:space="preserve"> générale</w:t>
       </w:r>
       <w:bookmarkEnd w:id="20"/>
     </w:p>
@@ -5140,7 +5443,29 @@
           <w:sz w:val="18"/>
           <w:szCs w:val="18"/>
         </w:rPr>
-        <w:t xml:space="preserve"> — La boucle de retour : l'humain qualifie l'alerte, le système se calibre.</w:t>
+        <w:t xml:space="preserve"> — La boucle de retour : l'humain qualifie l'alerte, le système </w:t>
+      </w:r>
+      <w:proofErr w:type="spellStart"/>
+      <w:r>
+        <w:rPr>
+          <w:i/>
+          <w:iCs/>
+          <w:color w:val="5B6B82"/>
+          <w:sz w:val="18"/>
+          <w:szCs w:val="18"/>
+        </w:rPr>
+        <w:t>se</w:t>
+      </w:r>
+      <w:proofErr w:type="spellEnd"/>
+      <w:r>
+        <w:rPr>
+          <w:i/>
+          <w:iCs/>
+          <w:color w:val="5B6B82"/>
+          <w:sz w:val="18"/>
+          <w:szCs w:val="18"/>
+        </w:rPr>
+        <w:t xml:space="preserve"> calibre.</w:t>
       </w:r>
     </w:p>
     <w:p>
@@ -5149,6 +5474,7 @@
         <w:pageBreakBefore/>
       </w:pPr>
       <w:bookmarkStart w:id="27" w:name="toc18"/>
+      <w:proofErr w:type="gramStart"/>
       <w:r>
         <w:rPr>
           <w:color w:val="D4A93C"/>
@@ -5157,7 +5483,11 @@
         <w:t xml:space="preserve">8  </w:t>
       </w:r>
       <w:r>
-        <w:t>La corrélation multi-sources, cœur de SIPDMS</w:t>
+        <w:t>La</w:t>
+      </w:r>
+      <w:proofErr w:type="gramEnd"/>
+      <w:r>
+        <w:t xml:space="preserve"> corrélation multi-sources, cœur de SIPDMS</w:t>
       </w:r>
       <w:bookmarkEnd w:id="27"/>
     </w:p>
@@ -5502,7 +5832,15 @@
         <w:t>taux normalisé = incidents signalés ÷ niveau d'observation de la zone</w:t>
       </w:r>
       <w:r>
-        <w:t xml:space="preserve"> (présence d'adultes). Ce risque d'auto-confirmation est documenté pour les systèmes de prédiction fondés sur des dossiers existants (Lum et Isaac, 2016).</w:t>
+        <w:t xml:space="preserve"> (présence d'adultes). Ce risque d'</w:t>
+      </w:r>
+      <w:proofErr w:type="spellStart"/>
+      <w:r>
+        <w:t>auto-confirmation</w:t>
+      </w:r>
+      <w:proofErr w:type="spellEnd"/>
+      <w:r>
+        <w:t xml:space="preserve"> est documenté pour les systèmes de prédiction fondés sur des dossiers existants (Lum et Isaac, 2016).</w:t>
       </w:r>
     </w:p>
     <w:p>
@@ -5511,6 +5849,7 @@
         <w:pageBreakBefore/>
       </w:pPr>
       <w:bookmarkStart w:id="32" w:name="toc22"/>
+      <w:proofErr w:type="gramStart"/>
       <w:r>
         <w:rPr>
           <w:color w:val="D4A93C"/>
@@ -5519,7 +5858,11 @@
         <w:t xml:space="preserve">9  </w:t>
       </w:r>
       <w:r>
-        <w:t>Trois scénarios pour comprendre SIPDMS</w:t>
+        <w:t>Trois</w:t>
+      </w:r>
+      <w:proofErr w:type="gramEnd"/>
+      <w:r>
+        <w:t xml:space="preserve"> scénarios pour comprendre SIPDMS</w:t>
       </w:r>
       <w:bookmarkEnd w:id="32"/>
     </w:p>
@@ -5827,7 +6170,15 @@
         <w:spacing w:after="130"/>
       </w:pPr>
       <w:r>
-        <w:t xml:space="preserve">Un enseignant délivre un pass de sortie. SIPDMS enregistre l'heure de départ. Si l'élève n'est toujours pas revenu après une durée anormalement longue (25 minutes dans notre prototype), le système recommande une </w:t>
+        <w:t xml:space="preserve">Un enseignant délivre un </w:t>
+      </w:r>
+      <w:proofErr w:type="spellStart"/>
+      <w:r>
+        <w:t>pass</w:t>
+      </w:r>
+      <w:proofErr w:type="spellEnd"/>
+      <w:r>
+        <w:t xml:space="preserve"> de sortie. SIPDMS enregistre l'heure de départ. Si l'élève n'est toujours pas revenu après une durée anormalement longue (25 minutes dans notre prototype), le système recommande une </w:t>
       </w:r>
       <w:r>
         <w:rPr>
@@ -5915,7 +6266,29 @@
           <w:sz w:val="18"/>
           <w:szCs w:val="18"/>
         </w:rPr>
-        <w:t xml:space="preserve"> — La règle du pass : un seuil de durée, un retour enregistré annule tout signal.</w:t>
+        <w:t xml:space="preserve"> — La règle du </w:t>
+      </w:r>
+      <w:proofErr w:type="spellStart"/>
+      <w:r>
+        <w:rPr>
+          <w:i/>
+          <w:iCs/>
+          <w:color w:val="5B6B82"/>
+          <w:sz w:val="18"/>
+          <w:szCs w:val="18"/>
+        </w:rPr>
+        <w:t>pass</w:t>
+      </w:r>
+      <w:proofErr w:type="spellEnd"/>
+      <w:r>
+        <w:rPr>
+          <w:i/>
+          <w:iCs/>
+          <w:color w:val="5B6B82"/>
+          <w:sz w:val="18"/>
+          <w:szCs w:val="18"/>
+        </w:rPr>
+        <w:t xml:space="preserve"> : un seuil de durée, un retour enregistré annule tout signal.</w:t>
       </w:r>
     </w:p>
     <w:p>
@@ -5930,7 +6303,15 @@
         <w:t>Ce n'est pas une « police des toilettes ».</w:t>
       </w:r>
       <w:r>
-        <w:t xml:space="preserve"> Le système ne compte pas les sorties d'un élève, ne les met pas en statistique individuelle et n'enregistre rien d'autre que la durée. Les données du pass sont effacées au retour. L'angle est la </w:t>
+        <w:t xml:space="preserve"> Le système ne compte pas les sorties d'un élève, ne les met pas en statistique individuelle et n'enregistre rien d'autre que la durée. Les données du </w:t>
+      </w:r>
+      <w:proofErr w:type="spellStart"/>
+      <w:r>
+        <w:t>pass</w:t>
+      </w:r>
+      <w:proofErr w:type="spellEnd"/>
+      <w:r>
+        <w:t xml:space="preserve"> sont effacées au retour. L'angle est la </w:t>
       </w:r>
       <w:r>
         <w:rPr>
@@ -5974,6 +6355,7 @@
         <w:pageBreakBefore/>
       </w:pPr>
       <w:bookmarkStart w:id="39" w:name="toc26"/>
+      <w:proofErr w:type="gramStart"/>
       <w:r>
         <w:rPr>
           <w:color w:val="D4A93C"/>
@@ -5982,7 +6364,11 @@
         <w:t xml:space="preserve">10  </w:t>
       </w:r>
       <w:r>
-        <w:t>La prévention : une partie aussi importante que la détection</w:t>
+        <w:t>La</w:t>
+      </w:r>
+      <w:proofErr w:type="gramEnd"/>
+      <w:r>
+        <w:t xml:space="preserve"> prévention : une partie aussi importante que la détection</w:t>
       </w:r>
       <w:bookmarkEnd w:id="39"/>
     </w:p>
@@ -6110,8 +6496,13 @@
         </w:numPr>
         <w:spacing w:after="70" w:line="280" w:lineRule="auto"/>
       </w:pPr>
-      <w:r>
-        <w:t>renforcer la présence adulte autour du bâtiment B entre 12 h 45 et 13 h 30 ;</w:t>
+      <w:proofErr w:type="gramStart"/>
+      <w:r>
+        <w:t>renforcer</w:t>
+      </w:r>
+      <w:proofErr w:type="gramEnd"/>
+      <w:r>
+        <w:t xml:space="preserve"> la présence adulte autour du bâtiment B entre 12 h 45 et 13 h 30 ;</w:t>
       </w:r>
     </w:p>
     <w:p>
@@ -6123,8 +6514,13 @@
         </w:numPr>
         <w:spacing w:after="70" w:line="280" w:lineRule="auto"/>
       </w:pPr>
-      <w:r>
-        <w:t>améliorer l'éclairage ou modifier un flux de circulation ;</w:t>
+      <w:proofErr w:type="gramStart"/>
+      <w:r>
+        <w:t>améliorer</w:t>
+      </w:r>
+      <w:proofErr w:type="gramEnd"/>
+      <w:r>
+        <w:t xml:space="preserve"> l'éclairage ou modifier un flux de circulation ;</w:t>
       </w:r>
     </w:p>
     <w:p>
@@ -6136,8 +6532,13 @@
         </w:numPr>
         <w:spacing w:after="70" w:line="280" w:lineRule="auto"/>
       </w:pPr>
-      <w:r>
-        <w:t>proposer une médiation après répétition d'un même type de signalement ;</w:t>
+      <w:proofErr w:type="gramStart"/>
+      <w:r>
+        <w:t>proposer</w:t>
+      </w:r>
+      <w:proofErr w:type="gramEnd"/>
+      <w:r>
+        <w:t xml:space="preserve"> une médiation après répétition d'un même type de signalement ;</w:t>
       </w:r>
     </w:p>
     <w:p>
@@ -6149,8 +6550,13 @@
         </w:numPr>
         <w:spacing w:after="70" w:line="280" w:lineRule="auto"/>
       </w:pPr>
-      <w:r>
-        <w:t>organiser une sensibilisation ciblée, sans désigner de personnes ;</w:t>
+      <w:proofErr w:type="gramStart"/>
+      <w:r>
+        <w:t>organiser</w:t>
+      </w:r>
+      <w:proofErr w:type="gramEnd"/>
+      <w:r>
+        <w:t xml:space="preserve"> une sensibilisation ciblée, sans désigner de personnes ;</w:t>
       </w:r>
     </w:p>
     <w:p>
@@ -6162,8 +6568,13 @@
         </w:numPr>
         <w:spacing w:after="140" w:line="280" w:lineRule="auto"/>
       </w:pPr>
-      <w:r>
-        <w:t>réaménager un espace ou un horaire (échelonner les sorties, par exemple).</w:t>
+      <w:proofErr w:type="gramStart"/>
+      <w:r>
+        <w:t>réaménager</w:t>
+      </w:r>
+      <w:proofErr w:type="gramEnd"/>
+      <w:r>
+        <w:t xml:space="preserve"> un espace ou un horaire (échelonner les sorties, par exemple).</w:t>
       </w:r>
     </w:p>
     <w:p>
@@ -6222,7 +6633,15 @@
         <w:t>Protection immédiate</w:t>
       </w:r>
       <w:r>
-        <w:t xml:space="preserve"> : aucune fuite vers la personne mise en cause, aucune représaille tolérée ;</w:t>
+        <w:t xml:space="preserve"> : aucune fuite vers la personne mise en cause, aucune </w:t>
+      </w:r>
+      <w:proofErr w:type="spellStart"/>
+      <w:r>
+        <w:t>représaille</w:t>
+      </w:r>
+      <w:proofErr w:type="spellEnd"/>
+      <w:r>
+        <w:t xml:space="preserve"> tolérée ;</w:t>
       </w:r>
     </w:p>
     <w:p>
@@ -6483,6 +6902,7 @@
         <w:pageBreakBefore/>
       </w:pPr>
       <w:bookmarkStart w:id="46" w:name="toc31"/>
+      <w:proofErr w:type="gramStart"/>
       <w:r>
         <w:rPr>
           <w:color w:val="D4A93C"/>
@@ -6491,7 +6911,11 @@
         <w:t xml:space="preserve">11  </w:t>
       </w:r>
       <w:r>
-        <w:t>Le tableau de bord et les rôles</w:t>
+        <w:t>Le</w:t>
+      </w:r>
+      <w:proofErr w:type="gramEnd"/>
+      <w:r>
+        <w:t xml:space="preserve"> tableau de bord et les rôles</w:t>
       </w:r>
       <w:bookmarkEnd w:id="46"/>
     </w:p>
@@ -6679,6 +7103,7 @@
         <w:pageBreakBefore/>
       </w:pPr>
       <w:bookmarkStart w:id="48" w:name="toc32"/>
+      <w:proofErr w:type="gramStart"/>
       <w:r>
         <w:rPr>
           <w:color w:val="D4A93C"/>
@@ -6687,7 +7112,11 @@
         <w:t xml:space="preserve">12  </w:t>
       </w:r>
       <w:r>
-        <w:t>Évaluation expérimentale : prouver que l'IA apporte quelque chose</w:t>
+        <w:t>Évaluation</w:t>
+      </w:r>
+      <w:proofErr w:type="gramEnd"/>
+      <w:r>
+        <w:t xml:space="preserve"> expérimentale : prouver que l'IA apporte quelque chose</w:t>
       </w:r>
       <w:bookmarkEnd w:id="48"/>
     </w:p>
@@ -6892,7 +7321,15 @@
         <w:t>A — Règles seules.</w:t>
       </w:r>
       <w:r>
-        <w:t xml:space="preserve"> Mots d'urgence exacts ; trois signalements de même catégorie déclarée et même zone déclarée en 7 jours ; pass supérieur à 25 minutes.</w:t>
+        <w:t xml:space="preserve"> Mots d'urgence exacts ; trois signalements de même catégorie déclarée et même zone déclarée en 7 jours ; </w:t>
+      </w:r>
+      <w:proofErr w:type="spellStart"/>
+      <w:r>
+        <w:t>pass</w:t>
+      </w:r>
+      <w:proofErr w:type="spellEnd"/>
+      <w:r>
+        <w:t xml:space="preserve"> supérieur à 25 minutes.</w:t>
       </w:r>
     </w:p>
     <w:p>
@@ -7868,7 +8305,15 @@
         <w:ind w:left="260" w:right="160"/>
       </w:pPr>
       <w:r>
-        <w:t xml:space="preserve">Les résultats dépendent de nos hypothèses (niveaux de bruit, qualité des champs, lexiques). Ils changeraient avec d'autres réglages. Notre brique TALN simulée repose sur un lexique de concepts, pas encore sur des embeddings multilingues. Le script de simulation est fourni pour que chacun puisse </w:t>
+        <w:t xml:space="preserve">Les résultats dépendent de nos hypothèses (niveaux de bruit, qualité des champs, lexiques). Ils changeraient avec d'autres réglages. Notre brique TALN simulée repose sur un lexique de concepts, pas encore sur des </w:t>
+      </w:r>
+      <w:proofErr w:type="spellStart"/>
+      <w:r>
+        <w:t>embeddings</w:t>
+      </w:r>
+      <w:proofErr w:type="spellEnd"/>
+      <w:r>
+        <w:t xml:space="preserve"> multilingues. Le script de simulation est fourni pour que chacun puisse </w:t>
       </w:r>
       <w:r>
         <w:rPr>
@@ -7887,7 +8332,15 @@
       </w:pPr>
       <w:bookmarkStart w:id="54" w:name="toc36"/>
       <w:r>
-        <w:t>Le mini-test humain</w:t>
+        <w:t xml:space="preserve">Le </w:t>
+      </w:r>
+      <w:proofErr w:type="spellStart"/>
+      <w:r>
+        <w:t>mini-test</w:t>
+      </w:r>
+      <w:proofErr w:type="spellEnd"/>
+      <w:r>
+        <w:t xml:space="preserve"> humain</w:t>
       </w:r>
       <w:bookmarkEnd w:id="54"/>
     </w:p>
@@ -7923,6 +8376,7 @@
         </w:numPr>
         <w:spacing w:after="80" w:line="280" w:lineRule="auto"/>
       </w:pPr>
+      <w:proofErr w:type="gramStart"/>
       <w:r>
         <w:rPr>
           <w:b/>
@@ -7930,6 +8384,7 @@
         </w:rPr>
         <w:t>manuellement</w:t>
       </w:r>
+      <w:proofErr w:type="gramEnd"/>
       <w:r>
         <w:t>, avec les documents papier ;</w:t>
       </w:r>
@@ -7943,12 +8398,21 @@
         </w:numPr>
         <w:spacing w:after="80" w:line="280" w:lineRule="auto"/>
       </w:pPr>
-      <w:r>
-        <w:rPr>
-          <w:b/>
-          <w:bCs/>
-        </w:rPr>
-        <w:t>avec SIPDMS</w:t>
+      <w:proofErr w:type="gramStart"/>
+      <w:r>
+        <w:rPr>
+          <w:b/>
+          <w:bCs/>
+        </w:rPr>
+        <w:t>avec</w:t>
+      </w:r>
+      <w:proofErr w:type="gramEnd"/>
+      <w:r>
+        <w:rPr>
+          <w:b/>
+          <w:bCs/>
+        </w:rPr>
+        <w:t xml:space="preserve"> SIPDMS</w:t>
       </w:r>
       <w:r>
         <w:t>, sur le tableau de bord.</w:t>
@@ -8094,6 +8558,7 @@
         <w:pageBreakBefore/>
       </w:pPr>
       <w:bookmarkStart w:id="57" w:name="toc38"/>
+      <w:proofErr w:type="gramStart"/>
       <w:r>
         <w:rPr>
           <w:color w:val="D4A93C"/>
@@ -8102,7 +8567,11 @@
         <w:t xml:space="preserve">13  </w:t>
       </w:r>
       <w:r>
-        <w:t>Éthique, sécurité et protection des mineurs</w:t>
+        <w:t>Éthique</w:t>
+      </w:r>
+      <w:proofErr w:type="gramEnd"/>
+      <w:r>
+        <w:t>, sécurité et protection des mineurs</w:t>
       </w:r>
       <w:bookmarkEnd w:id="57"/>
     </w:p>
@@ -8403,7 +8872,15 @@
         <w:ind w:left="520" w:right="160" w:hanging="260"/>
       </w:pPr>
       <w:r>
-        <w:t>•  pour un pass : l'heure de départ et de retour, effacée au retour ;</w:t>
+        <w:t xml:space="preserve">•  pour un </w:t>
+      </w:r>
+      <w:proofErr w:type="spellStart"/>
+      <w:r>
+        <w:t>pass</w:t>
+      </w:r>
+      <w:proofErr w:type="spellEnd"/>
+      <w:r>
+        <w:t xml:space="preserve"> : l'heure de départ et de retour, effacée au retour ;</w:t>
       </w:r>
     </w:p>
     <w:p>
@@ -8614,6 +9091,7 @@
         <w:pageBreakBefore/>
       </w:pPr>
       <w:bookmarkStart w:id="62" w:name="toc42"/>
+      <w:proofErr w:type="gramStart"/>
       <w:r>
         <w:rPr>
           <w:color w:val="D4A93C"/>
@@ -8622,7 +9100,11 @@
         <w:t xml:space="preserve">14  </w:t>
       </w:r>
       <w:r>
-        <w:t>Limites : ce que SIPDMS ne sait pas faire</w:t>
+        <w:t>Limites</w:t>
+      </w:r>
+      <w:proofErr w:type="gramEnd"/>
+      <w:r>
+        <w:t xml:space="preserve"> : ce que SIPDMS ne sait pas faire</w:t>
       </w:r>
       <w:bookmarkEnd w:id="62"/>
     </w:p>
@@ -8755,6 +9237,7 @@
         <w:pageBreakBefore/>
       </w:pPr>
       <w:bookmarkStart w:id="63" w:name="toc43"/>
+      <w:proofErr w:type="gramStart"/>
       <w:r>
         <w:rPr>
           <w:color w:val="D4A93C"/>
@@ -8763,7 +9246,11 @@
         <w:t xml:space="preserve">15  </w:t>
       </w:r>
       <w:r>
-        <w:t>Faisabilité technique et architecture technique</w:t>
+        <w:t>Faisabilité</w:t>
+      </w:r>
+      <w:proofErr w:type="gramEnd"/>
+      <w:r>
+        <w:t xml:space="preserve"> technique et architecture technique</w:t>
       </w:r>
       <w:bookmarkEnd w:id="63"/>
     </w:p>
@@ -8890,7 +9377,23 @@
         <w:t>Langage et bibliothèques courants</w:t>
       </w:r>
       <w:r>
-        <w:t xml:space="preserve"> : Python, pandas, scikit-learn, et des modèles d'embeddings déjà entraînés ;</w:t>
+        <w:t xml:space="preserve"> : Python, pandas, </w:t>
+      </w:r>
+      <w:proofErr w:type="spellStart"/>
+      <w:r>
+        <w:t>scikit-learn</w:t>
+      </w:r>
+      <w:proofErr w:type="spellEnd"/>
+      <w:r>
+        <w:t>, et des modèles d'</w:t>
+      </w:r>
+      <w:proofErr w:type="spellStart"/>
+      <w:r>
+        <w:t>embeddings</w:t>
+      </w:r>
+      <w:proofErr w:type="spellEnd"/>
+      <w:r>
+        <w:t xml:space="preserve"> déjà entraînés ;</w:t>
       </w:r>
     </w:p>
     <w:p>
@@ -9075,7 +9578,15 @@
         <w:spacing w:after="130"/>
       </w:pPr>
       <w:r>
-        <w:t>En cinq minutes : un signalement saisi à la borne, la réception des deux autres, la tendance détectée avec ses raisons, la carte de chaleur, puis un pass resté ouvert et sa vérification de bien-être. Le tout sur données simulées, signalées comme telles à l'écran.</w:t>
+        <w:t xml:space="preserve">En cinq minutes : un signalement saisi à la borne, la réception des deux autres, la tendance détectée avec ses raisons, la carte de chaleur, puis un </w:t>
+      </w:r>
+      <w:proofErr w:type="spellStart"/>
+      <w:r>
+        <w:t>pass</w:t>
+      </w:r>
+      <w:proofErr w:type="spellEnd"/>
+      <w:r>
+        <w:t xml:space="preserve"> resté ouvert et sa vérification de bien-être. Le tout sur données simulées, signalées comme telles à l'écran.</w:t>
       </w:r>
     </w:p>
     <w:p>
@@ -9083,6 +9594,7 @@
         <w:pStyle w:val="Titre1"/>
       </w:pPr>
       <w:bookmarkStart w:id="69" w:name="toc48"/>
+      <w:proofErr w:type="gramStart"/>
       <w:r>
         <w:rPr>
           <w:color w:val="D4A93C"/>
@@ -9090,7 +9602,11 @@
         <w:t xml:space="preserve">16  </w:t>
       </w:r>
       <w:r>
-        <w:t>Évolution du projet : une roadmap réaliste</w:t>
+        <w:t>Évolution</w:t>
+      </w:r>
+      <w:proofErr w:type="gramEnd"/>
+      <w:r>
+        <w:t xml:space="preserve"> du projet : une roadmap réaliste</w:t>
       </w:r>
       <w:bookmarkEnd w:id="69"/>
     </w:p>
@@ -9204,7 +9720,15 @@
         <w:t>V2 : TALN et similarité sémantique.</w:t>
       </w:r>
       <w:r>
-        <w:t xml:space="preserve"> Embeddings multilingues, test sur un corpus rédigé par l'équipe. </w:t>
+        <w:t xml:space="preserve"> </w:t>
+      </w:r>
+      <w:proofErr w:type="spellStart"/>
+      <w:r>
+        <w:t>Embeddings</w:t>
+      </w:r>
+      <w:proofErr w:type="spellEnd"/>
+      <w:r>
+        <w:t xml:space="preserve"> multilingues, test sur un corpus rédigé par l'équipe. </w:t>
       </w:r>
       <w:r>
         <w:rPr>
@@ -9224,7 +9748,15 @@
         <w:t>V4 : prévention et évaluation.</w:t>
       </w:r>
       <w:r>
-        <w:t xml:space="preserve"> Mesure avant/après, mini-test humain, enquête de climat. </w:t>
+        <w:t xml:space="preserve"> Mesure avant/après, </w:t>
+      </w:r>
+      <w:proofErr w:type="spellStart"/>
+      <w:r>
+        <w:t>mini-test</w:t>
+      </w:r>
+      <w:proofErr w:type="spellEnd"/>
+      <w:r>
+        <w:t xml:space="preserve"> humain, enquête de climat. </w:t>
       </w:r>
       <w:r>
         <w:rPr>
@@ -9316,6 +9848,7 @@
         <w:pageBreakBefore/>
       </w:pPr>
       <w:bookmarkStart w:id="73" w:name="toc51"/>
+      <w:proofErr w:type="gramStart"/>
       <w:r>
         <w:rPr>
           <w:color w:val="D4A93C"/>
@@ -9324,7 +9857,11 @@
         <w:t xml:space="preserve">17  </w:t>
       </w:r>
       <w:r>
-        <w:t>FAQ du jury</w:t>
+        <w:t>FAQ</w:t>
+      </w:r>
+      <w:proofErr w:type="gramEnd"/>
+      <w:r>
+        <w:t xml:space="preserve"> du jury</w:t>
       </w:r>
       <w:bookmarkEnd w:id="73"/>
     </w:p>
@@ -9354,7 +9891,15 @@
         <w:spacing w:after="60"/>
       </w:pPr>
       <w:r>
-        <w:t>Parce que certains problèmes sont difficiles à traiter à la main : rapprocher des textes formulés différemment, repérer une répétition dans le temps et l'espace. Mais nous n'en mettons pas partout : le pass de sortie est un simple moteur de règles.</w:t>
+        <w:t xml:space="preserve">Parce que certains problèmes sont difficiles à traiter à la main : rapprocher des textes formulés différemment, repérer une répétition dans le temps et l'espace. Mais nous n'en mettons pas partout : le </w:t>
+      </w:r>
+      <w:proofErr w:type="spellStart"/>
+      <w:r>
+        <w:t>pass</w:t>
+      </w:r>
+      <w:proofErr w:type="spellEnd"/>
+      <w:r>
+        <w:t xml:space="preserve"> de sortie est un simple moteur de règles.</w:t>
       </w:r>
     </w:p>
     <w:p>
@@ -9441,7 +9986,15 @@
         <w:spacing w:after="60"/>
       </w:pPr>
       <w:r>
-        <w:t>Nous normalisons par le niveau d'observation, nous suivons les alertes jugées fausses par zone, et nous n'utilisons aucun profil d'élève. Le risque d'auto-confirmation est connu des systèmes de prédiction (Lum et Isaac, 2016) : nous l'avons intégré dès la conception.</w:t>
+        <w:t>Nous normalisons par le niveau d'observation, nous suivons les alertes jugées fausses par zone, et nous n'utilisons aucun profil d'élève. Le risque d'</w:t>
+      </w:r>
+      <w:proofErr w:type="spellStart"/>
+      <w:r>
+        <w:t>auto-confirmation</w:t>
+      </w:r>
+      <w:proofErr w:type="spellEnd"/>
+      <w:r>
+        <w:t xml:space="preserve"> est connu des systèmes de prédiction (Lum et Isaac, 2016) : nous l'avons intégré dès la conception.</w:t>
       </w:r>
     </w:p>
     <w:p>
@@ -9695,7 +10248,29 @@
           <w:sz w:val="22"/>
           <w:szCs w:val="22"/>
         </w:rPr>
-        <w:t>Comment prouvez-vous que l'IA apporte quelque chose ?</w:t>
+        <w:t xml:space="preserve">Comment </w:t>
+      </w:r>
+      <w:proofErr w:type="spellStart"/>
+      <w:r>
+        <w:rPr>
+          <w:b/>
+          <w:bCs/>
+          <w:color w:val="1F6FEB"/>
+          <w:sz w:val="22"/>
+          <w:szCs w:val="22"/>
+        </w:rPr>
+        <w:t>prouvez-vous</w:t>
+      </w:r>
+      <w:proofErr w:type="spellEnd"/>
+      <w:r>
+        <w:rPr>
+          <w:b/>
+          <w:bCs/>
+          <w:color w:val="1F6FEB"/>
+          <w:sz w:val="22"/>
+          <w:szCs w:val="22"/>
+        </w:rPr>
+        <w:t xml:space="preserve"> que l'IA apporte quelque chose ?</w:t>
       </w:r>
     </w:p>
     <w:p>
@@ -9770,6 +10345,7 @@
         <w:pageBreakBefore/>
       </w:pPr>
       <w:bookmarkStart w:id="74" w:name="toc52"/>
+      <w:proofErr w:type="gramStart"/>
       <w:r>
         <w:rPr>
           <w:color w:val="D4A93C"/>
@@ -9781,6 +10357,7 @@
         <w:t>Conclusion</w:t>
       </w:r>
       <w:bookmarkEnd w:id="74"/>
+      <w:proofErr w:type="gramEnd"/>
     </w:p>
     <w:p>
       <w:pPr>
@@ -9883,6 +10460,7 @@
         <w:pageBreakBefore/>
       </w:pPr>
       <w:bookmarkStart w:id="75" w:name="toc53"/>
+      <w:proofErr w:type="gramStart"/>
       <w:r>
         <w:rPr>
           <w:color w:val="D4A93C"/>
@@ -9891,7 +10469,11 @@
         <w:t xml:space="preserve">19  </w:t>
       </w:r>
       <w:r>
-        <w:t>Sources et références</w:t>
+        <w:t>Sources</w:t>
+      </w:r>
+      <w:proofErr w:type="gramEnd"/>
+      <w:r>
+        <w:t xml:space="preserve"> et références</w:t>
       </w:r>
       <w:bookmarkEnd w:id="75"/>
     </w:p>
@@ -9933,6 +10515,7 @@
         </w:rPr>
         <w:t xml:space="preserve">UNESCO (2019). </w:t>
       </w:r>
+      <w:proofErr w:type="spellStart"/>
       <w:r>
         <w:rPr>
           <w:i/>
@@ -9940,28 +10523,9 @@
           <w:sz w:val="19"/>
           <w:szCs w:val="19"/>
         </w:rPr>
-        <w:t>Behind the numbers: Ending school violence and bullying</w:t>
-      </w:r>
-      <w:r>
-        <w:rPr>
-          <w:sz w:val="19"/>
-          <w:szCs w:val="19"/>
-        </w:rPr>
-        <w:t>. Paris : UNESCO. 32 % des élèves victimes de harcèlement par leurs pairs au cours du dernier mois ; 48,2 % en Afrique subsaharienne ; données de 144 pays et territoires. https://unesdoc.unesco.org/ark:/48223/pf0000366483</w:t>
-      </w:r>
-    </w:p>
-    <w:p>
-      <w:pPr>
-        <w:spacing w:after="90" w:line="260" w:lineRule="auto"/>
-        <w:ind w:left="360" w:hanging="360"/>
-      </w:pPr>
-      <w:r>
-        <w:rPr>
-          <w:sz w:val="19"/>
-          <w:szCs w:val="19"/>
-        </w:rPr>
-        <w:t xml:space="preserve">UNESCO (2019). </w:t>
-      </w:r>
+        <w:t>Behind</w:t>
+      </w:r>
+      <w:proofErr w:type="spellEnd"/>
       <w:r>
         <w:rPr>
           <w:i/>
@@ -9969,34 +10533,10 @@
           <w:sz w:val="19"/>
           <w:szCs w:val="19"/>
         </w:rPr>
-        <w:t>School violence and bullying a major global issue, new UNESCO publication finds</w:t>
-      </w:r>
-      <w:r>
-        <w:rPr>
-          <w:sz w:val="19"/>
-          <w:szCs w:val="19"/>
-        </w:rPr>
-        <w:t xml:space="preserve"> (communiqué). https://www.unesco.org/en/articles/school-violence-and-bullying-major-global-issue-new-unesco-publication-finds</w:t>
-      </w:r>
-    </w:p>
-    <w:p>
-      <w:pPr>
-        <w:spacing w:after="90" w:line="260" w:lineRule="auto"/>
-        <w:ind w:left="360" w:hanging="360"/>
-      </w:pPr>
-      <w:r>
-        <w:rPr>
-          <w:sz w:val="19"/>
-          <w:szCs w:val="19"/>
-        </w:rPr>
-        <w:t>Analyse multi-pays de la victimisation par harcèlement chez les adolescents scolarisés en Afrique subsaharienne, données GSHS 2010–2017, 11 pays, 25 454 élèves, prévalence globale 38,8 %. PubMed Central, PMC8252267. https://www.ncbi.nlm.nih.gov/pmc/articles/PMC8252267/</w:t>
-      </w:r>
-    </w:p>
-    <w:p>
-      <w:pPr>
-        <w:spacing w:after="90" w:line="260" w:lineRule="auto"/>
-        <w:ind w:left="360" w:hanging="360"/>
-      </w:pPr>
+        <w:t xml:space="preserve"> the </w:t>
+      </w:r>
+      <w:proofErr w:type="spellStart"/>
+      <w:proofErr w:type="gramStart"/>
       <w:r>
         <w:rPr>
           <w:i/>
@@ -10004,28 +10544,9 @@
           <w:sz w:val="19"/>
           <w:szCs w:val="19"/>
         </w:rPr>
-        <w:t>Violences genrées en milieu scolaire au Cameroun (2015–2024) : une analyse documentaire</w:t>
-      </w:r>
-      <w:r>
-        <w:rPr>
-          <w:sz w:val="19"/>
-          <w:szCs w:val="19"/>
-        </w:rPr>
-        <w:t>. European Scientific Journal, 2025. https://eujournal.org/index.php/esj/article/view/19596</w:t>
-      </w:r>
-    </w:p>
-    <w:p>
-      <w:pPr>
-        <w:spacing w:after="90" w:line="260" w:lineRule="auto"/>
-        <w:ind w:left="360" w:hanging="360"/>
-      </w:pPr>
-      <w:r>
-        <w:rPr>
-          <w:sz w:val="19"/>
-          <w:szCs w:val="19"/>
-        </w:rPr>
-        <w:t xml:space="preserve">Cameroon Tribune (2022). </w:t>
-      </w:r>
+        <w:t>numbers</w:t>
+      </w:r>
+      <w:proofErr w:type="spellEnd"/>
       <w:r>
         <w:rPr>
           <w:i/>
@@ -10033,36 +10554,9 @@
           <w:sz w:val="19"/>
           <w:szCs w:val="19"/>
         </w:rPr>
-        <w:t>Violences en milieu scolaire : la cote d'alerte !</w:t>
-      </w:r>
-      <w:r>
-        <w:rPr>
-          <w:sz w:val="19"/>
-          <w:szCs w:val="19"/>
-        </w:rPr>
-        <w:t xml:space="preserve"> https://www.cameroon-tribune.cm/article.html/47513/fr.html/violences-en-milieu-scolaire-la-cote-dalerte</w:t>
-      </w:r>
-    </w:p>
-    <w:p>
-      <w:pPr>
-        <w:pStyle w:val="Titre3"/>
-      </w:pPr>
-      <w:r>
-        <w:t>Cadre juridique (à valider par un conseil juridique avant tout déploiement)</w:t>
-      </w:r>
-    </w:p>
-    <w:p>
-      <w:pPr>
-        <w:spacing w:after="90" w:line="260" w:lineRule="auto"/>
-        <w:ind w:left="360" w:hanging="360"/>
-      </w:pPr>
-      <w:r>
-        <w:rPr>
-          <w:sz w:val="19"/>
-          <w:szCs w:val="19"/>
-        </w:rPr>
-        <w:t xml:space="preserve">République du Cameroun (2024). </w:t>
-      </w:r>
+        <w:t>:</w:t>
+      </w:r>
+      <w:proofErr w:type="gramEnd"/>
       <w:r>
         <w:rPr>
           <w:i/>
@@ -10070,28 +10564,9 @@
           <w:sz w:val="19"/>
           <w:szCs w:val="19"/>
         </w:rPr>
-        <w:t>Loi n° 2024/017 du 23 décembre 2024 relative à la protection des données à caractère personnel au Cameroun</w:t>
-      </w:r>
-      <w:r>
-        <w:rPr>
-          <w:sz w:val="19"/>
-          <w:szCs w:val="19"/>
-        </w:rPr>
-        <w:t>. Texte : https://www.juriafrica.com/lex/link/loi-2024-017-23-decembre-2024/56221.htm</w:t>
-      </w:r>
-    </w:p>
-    <w:p>
-      <w:pPr>
-        <w:spacing w:after="90" w:line="260" w:lineRule="auto"/>
-        <w:ind w:left="360" w:hanging="360"/>
-      </w:pPr>
-      <w:r>
-        <w:rPr>
-          <w:sz w:val="19"/>
-          <w:szCs w:val="19"/>
-        </w:rPr>
-        <w:t xml:space="preserve">République du Cameroun (2010). </w:t>
-      </w:r>
+        <w:t xml:space="preserve"> </w:t>
+      </w:r>
+      <w:proofErr w:type="spellStart"/>
       <w:r>
         <w:rPr>
           <w:i/>
@@ -10099,36 +10574,9 @@
           <w:sz w:val="19"/>
           <w:szCs w:val="19"/>
         </w:rPr>
-        <w:t>Loi n° 2010/012 du 21 décembre 2010 relative à la cybersécurité et à la cybercriminalité au Cameroun</w:t>
-      </w:r>
-      <w:r>
-        <w:rPr>
-          <w:sz w:val="19"/>
-          <w:szCs w:val="19"/>
-        </w:rPr>
-        <w:t>.</w:t>
-      </w:r>
-    </w:p>
-    <w:p>
-      <w:pPr>
-        <w:pStyle w:val="Titre3"/>
-      </w:pPr>
-      <w:r>
-        <w:t>Méthodes d'IA et de prévention</w:t>
-      </w:r>
-    </w:p>
-    <w:p>
-      <w:pPr>
-        <w:spacing w:after="90" w:line="260" w:lineRule="auto"/>
-        <w:ind w:left="360" w:hanging="360"/>
-      </w:pPr>
-      <w:r>
-        <w:rPr>
-          <w:sz w:val="19"/>
-          <w:szCs w:val="19"/>
-        </w:rPr>
-        <w:t xml:space="preserve">Reimers, N. et Gurevych, I. (2019). Sentence-BERT: Sentence Embeddings using Siamese BERT-Networks. </w:t>
-      </w:r>
+        <w:t>Ending</w:t>
+      </w:r>
+      <w:proofErr w:type="spellEnd"/>
       <w:r>
         <w:rPr>
           <w:i/>
@@ -10136,28 +10584,9 @@
           <w:sz w:val="19"/>
           <w:szCs w:val="19"/>
         </w:rPr>
-        <w:t>EMNLP-IJCNLP 2019</w:t>
-      </w:r>
-      <w:r>
-        <w:rPr>
-          <w:sz w:val="19"/>
-          <w:szCs w:val="19"/>
-        </w:rPr>
-        <w:t>.</w:t>
-      </w:r>
-    </w:p>
-    <w:p>
-      <w:pPr>
-        <w:spacing w:after="90" w:line="260" w:lineRule="auto"/>
-        <w:ind w:left="360" w:hanging="360"/>
-      </w:pPr>
-      <w:r>
-        <w:rPr>
-          <w:sz w:val="19"/>
-          <w:szCs w:val="19"/>
-        </w:rPr>
-        <w:t xml:space="preserve">Reimers, N. et Gurevych, I. (2020). Making Monolingual Sentence Embeddings Multilingual using Knowledge Distillation. </w:t>
-      </w:r>
+        <w:t xml:space="preserve"> </w:t>
+      </w:r>
+      <w:proofErr w:type="spellStart"/>
       <w:r>
         <w:rPr>
           <w:i/>
@@ -10165,28 +10594,9 @@
           <w:sz w:val="19"/>
           <w:szCs w:val="19"/>
         </w:rPr>
-        <w:t>EMNLP 2020</w:t>
-      </w:r>
-      <w:r>
-        <w:rPr>
-          <w:sz w:val="19"/>
-          <w:szCs w:val="19"/>
-        </w:rPr>
-        <w:t>.</w:t>
-      </w:r>
-    </w:p>
-    <w:p>
-      <w:pPr>
-        <w:spacing w:after="90" w:line="260" w:lineRule="auto"/>
-        <w:ind w:left="360" w:hanging="360"/>
-      </w:pPr>
-      <w:r>
-        <w:rPr>
-          <w:sz w:val="19"/>
-          <w:szCs w:val="19"/>
-        </w:rPr>
-        <w:t xml:space="preserve">Chandola, V., Banerjee, A. et Kumar, V. (2009). Anomaly detection: A survey. </w:t>
-      </w:r>
+        <w:t>school</w:t>
+      </w:r>
+      <w:proofErr w:type="spellEnd"/>
       <w:r>
         <w:rPr>
           <w:i/>
@@ -10194,28 +10604,9 @@
           <w:sz w:val="19"/>
           <w:szCs w:val="19"/>
         </w:rPr>
-        <w:t>ACM Computing Surveys</w:t>
-      </w:r>
-      <w:r>
-        <w:rPr>
-          <w:sz w:val="19"/>
-          <w:szCs w:val="19"/>
-        </w:rPr>
-        <w:t>, 41(3).</w:t>
-      </w:r>
-    </w:p>
-    <w:p>
-      <w:pPr>
-        <w:spacing w:after="90" w:line="260" w:lineRule="auto"/>
-        <w:ind w:left="360" w:hanging="360"/>
-      </w:pPr>
-      <w:r>
-        <w:rPr>
-          <w:sz w:val="19"/>
-          <w:szCs w:val="19"/>
-        </w:rPr>
-        <w:t xml:space="preserve">Weisburd, D. (2015). The law of crime concentration and the criminology of place. </w:t>
-      </w:r>
+        <w:t xml:space="preserve"> violence and </w:t>
+      </w:r>
+      <w:proofErr w:type="spellStart"/>
       <w:r>
         <w:rPr>
           <w:i/>
@@ -10223,14 +10614,15 @@
           <w:sz w:val="19"/>
           <w:szCs w:val="19"/>
         </w:rPr>
-        <w:t>Criminology</w:t>
-      </w:r>
+        <w:t>bullying</w:t>
+      </w:r>
+      <w:proofErr w:type="spellEnd"/>
       <w:r>
         <w:rPr>
           <w:sz w:val="19"/>
           <w:szCs w:val="19"/>
         </w:rPr>
-        <w:t>, 53(2), 133–157.</w:t>
+        <w:t>. Paris : UNESCO. 32 % des élèves victimes de harcèlement par leurs pairs au cours du dernier mois ; 48,2 % en Afrique subsaharienne ; données de 144 pays et territoires. https://unesdoc.unesco.org/ark:/48223/pf0000366483</w:t>
       </w:r>
     </w:p>
     <w:p>
@@ -10243,7 +10635,7 @@
           <w:sz w:val="19"/>
           <w:szCs w:val="19"/>
         </w:rPr>
-        <w:t xml:space="preserve">Lum, K. et Isaac, W. (2016). To predict and serve? </w:t>
+        <w:t xml:space="preserve">UNESCO (2019). </w:t>
       </w:r>
       <w:r>
         <w:rPr>
@@ -10252,8 +10644,704 @@
           <w:sz w:val="19"/>
           <w:szCs w:val="19"/>
         </w:rPr>
+        <w:t xml:space="preserve">School violence and </w:t>
+      </w:r>
+      <w:proofErr w:type="spellStart"/>
+      <w:r>
+        <w:rPr>
+          <w:i/>
+          <w:iCs/>
+          <w:sz w:val="19"/>
+          <w:szCs w:val="19"/>
+        </w:rPr>
+        <w:t>bullying</w:t>
+      </w:r>
+      <w:proofErr w:type="spellEnd"/>
+      <w:r>
+        <w:rPr>
+          <w:i/>
+          <w:iCs/>
+          <w:sz w:val="19"/>
+          <w:szCs w:val="19"/>
+        </w:rPr>
+        <w:t xml:space="preserve"> a major global issue, new UNESCO publication </w:t>
+      </w:r>
+      <w:proofErr w:type="spellStart"/>
+      <w:r>
+        <w:rPr>
+          <w:i/>
+          <w:iCs/>
+          <w:sz w:val="19"/>
+          <w:szCs w:val="19"/>
+        </w:rPr>
+        <w:t>finds</w:t>
+      </w:r>
+      <w:proofErr w:type="spellEnd"/>
+      <w:r>
+        <w:rPr>
+          <w:sz w:val="19"/>
+          <w:szCs w:val="19"/>
+        </w:rPr>
+        <w:t xml:space="preserve"> (communiqué). https://www.unesco.org/en/articles/school-violence-and-bullying-major-global-issue-new-unesco-publication-finds</w:t>
+      </w:r>
+    </w:p>
+    <w:p>
+      <w:pPr>
+        <w:spacing w:after="90" w:line="260" w:lineRule="auto"/>
+        <w:ind w:left="360" w:hanging="360"/>
+      </w:pPr>
+      <w:r>
+        <w:rPr>
+          <w:sz w:val="19"/>
+          <w:szCs w:val="19"/>
+        </w:rPr>
+        <w:t>Analyse multi-pays de la victimisation par harcèlement chez les adolescents scolarisés en Afrique subsaharienne, données GSHS 2010–2017, 11 pays, 25 454 élèves, prévalence globale 38,8 %. PubMed Central, PMC8252267. https://www.ncbi.nlm.nih.gov/pmc/articles/PMC8252267/</w:t>
+      </w:r>
+    </w:p>
+    <w:p>
+      <w:pPr>
+        <w:spacing w:after="90" w:line="260" w:lineRule="auto"/>
+        <w:ind w:left="360" w:hanging="360"/>
+      </w:pPr>
+      <w:r>
+        <w:rPr>
+          <w:i/>
+          <w:iCs/>
+          <w:sz w:val="19"/>
+          <w:szCs w:val="19"/>
+        </w:rPr>
+        <w:t>Violences genrées en milieu scolaire au Cameroun (2015–2024) : une analyse documentaire</w:t>
+      </w:r>
+      <w:r>
+        <w:rPr>
+          <w:sz w:val="19"/>
+          <w:szCs w:val="19"/>
+        </w:rPr>
+        <w:t xml:space="preserve">. </w:t>
+      </w:r>
+      <w:proofErr w:type="spellStart"/>
+      <w:r>
+        <w:rPr>
+          <w:sz w:val="19"/>
+          <w:szCs w:val="19"/>
+        </w:rPr>
+        <w:t>European</w:t>
+      </w:r>
+      <w:proofErr w:type="spellEnd"/>
+      <w:r>
+        <w:rPr>
+          <w:sz w:val="19"/>
+          <w:szCs w:val="19"/>
+        </w:rPr>
+        <w:t xml:space="preserve"> Scientific Journal, 2025. https://eujournal.org/index.php/esj/article/view/19596</w:t>
+      </w:r>
+    </w:p>
+    <w:p>
+      <w:pPr>
+        <w:spacing w:after="90" w:line="260" w:lineRule="auto"/>
+        <w:ind w:left="360" w:hanging="360"/>
+      </w:pPr>
+      <w:proofErr w:type="spellStart"/>
+      <w:r>
+        <w:rPr>
+          <w:sz w:val="19"/>
+          <w:szCs w:val="19"/>
+        </w:rPr>
+        <w:t>Cameroon</w:t>
+      </w:r>
+      <w:proofErr w:type="spellEnd"/>
+      <w:r>
+        <w:rPr>
+          <w:sz w:val="19"/>
+          <w:szCs w:val="19"/>
+        </w:rPr>
+        <w:t xml:space="preserve"> Tribune (2022). </w:t>
+      </w:r>
+      <w:r>
+        <w:rPr>
+          <w:i/>
+          <w:iCs/>
+          <w:sz w:val="19"/>
+          <w:szCs w:val="19"/>
+        </w:rPr>
+        <w:t>Violences en milieu scolaire : la cote d'alerte !</w:t>
+      </w:r>
+      <w:r>
+        <w:rPr>
+          <w:sz w:val="19"/>
+          <w:szCs w:val="19"/>
+        </w:rPr>
+        <w:t xml:space="preserve"> https://www.cameroon-tribune.cm/article.html/47513/fr.html/violences-en-milieu-scolaire-la-cote-dalerte</w:t>
+      </w:r>
+    </w:p>
+    <w:p>
+      <w:pPr>
+        <w:pStyle w:val="Titre3"/>
+      </w:pPr>
+      <w:r>
+        <w:t>Cadre juridique (à valider par un conseil juridique avant tout déploiement)</w:t>
+      </w:r>
+    </w:p>
+    <w:p>
+      <w:pPr>
+        <w:spacing w:after="90" w:line="260" w:lineRule="auto"/>
+        <w:ind w:left="360" w:hanging="360"/>
+      </w:pPr>
+      <w:r>
+        <w:rPr>
+          <w:sz w:val="19"/>
+          <w:szCs w:val="19"/>
+        </w:rPr>
+        <w:t xml:space="preserve">République du Cameroun (2024). </w:t>
+      </w:r>
+      <w:r>
+        <w:rPr>
+          <w:i/>
+          <w:iCs/>
+          <w:sz w:val="19"/>
+          <w:szCs w:val="19"/>
+        </w:rPr>
+        <w:t>Loi n° 2024/017 du 23 décembre 2024 relative à la protection des données à caractère personnel au Cameroun</w:t>
+      </w:r>
+      <w:r>
+        <w:rPr>
+          <w:sz w:val="19"/>
+          <w:szCs w:val="19"/>
+        </w:rPr>
+        <w:t>. Texte : https://www.juriafrica.com/lex/link/loi-2024-017-23-decembre-2024/56221.htm</w:t>
+      </w:r>
+    </w:p>
+    <w:p>
+      <w:pPr>
+        <w:spacing w:after="90" w:line="260" w:lineRule="auto"/>
+        <w:ind w:left="360" w:hanging="360"/>
+      </w:pPr>
+      <w:r>
+        <w:rPr>
+          <w:sz w:val="19"/>
+          <w:szCs w:val="19"/>
+        </w:rPr>
+        <w:t xml:space="preserve">République du Cameroun (2010). </w:t>
+      </w:r>
+      <w:r>
+        <w:rPr>
+          <w:i/>
+          <w:iCs/>
+          <w:sz w:val="19"/>
+          <w:szCs w:val="19"/>
+        </w:rPr>
+        <w:t>Loi n° 2010/012 du 21 décembre 2010 relative à la cybersécurité et à la cybercriminalité au Cameroun</w:t>
+      </w:r>
+      <w:r>
+        <w:rPr>
+          <w:sz w:val="19"/>
+          <w:szCs w:val="19"/>
+        </w:rPr>
+        <w:t>.</w:t>
+      </w:r>
+    </w:p>
+    <w:p>
+      <w:pPr>
+        <w:pStyle w:val="Titre3"/>
+      </w:pPr>
+      <w:r>
+        <w:t>Méthodes d'IA et de prévention</w:t>
+      </w:r>
+    </w:p>
+    <w:p>
+      <w:pPr>
+        <w:spacing w:after="90" w:line="260" w:lineRule="auto"/>
+        <w:ind w:left="360" w:hanging="360"/>
+      </w:pPr>
+      <w:r>
+        <w:rPr>
+          <w:sz w:val="19"/>
+          <w:szCs w:val="19"/>
+        </w:rPr>
+        <w:t xml:space="preserve">Reimers, N. et </w:t>
+      </w:r>
+      <w:proofErr w:type="spellStart"/>
+      <w:r>
+        <w:rPr>
+          <w:sz w:val="19"/>
+          <w:szCs w:val="19"/>
+        </w:rPr>
+        <w:t>Gurevych</w:t>
+      </w:r>
+      <w:proofErr w:type="spellEnd"/>
+      <w:r>
+        <w:rPr>
+          <w:sz w:val="19"/>
+          <w:szCs w:val="19"/>
+        </w:rPr>
+        <w:t>, I. (2019). Sentence-</w:t>
+      </w:r>
+      <w:proofErr w:type="gramStart"/>
+      <w:r>
+        <w:rPr>
+          <w:sz w:val="19"/>
+          <w:szCs w:val="19"/>
+        </w:rPr>
+        <w:t>BERT:</w:t>
+      </w:r>
+      <w:proofErr w:type="gramEnd"/>
+      <w:r>
+        <w:rPr>
+          <w:sz w:val="19"/>
+          <w:szCs w:val="19"/>
+        </w:rPr>
+        <w:t xml:space="preserve"> Sentence </w:t>
+      </w:r>
+      <w:proofErr w:type="spellStart"/>
+      <w:r>
+        <w:rPr>
+          <w:sz w:val="19"/>
+          <w:szCs w:val="19"/>
+        </w:rPr>
+        <w:t>Embeddings</w:t>
+      </w:r>
+      <w:proofErr w:type="spellEnd"/>
+      <w:r>
+        <w:rPr>
+          <w:sz w:val="19"/>
+          <w:szCs w:val="19"/>
+        </w:rPr>
+        <w:t xml:space="preserve"> </w:t>
+      </w:r>
+      <w:proofErr w:type="spellStart"/>
+      <w:r>
+        <w:rPr>
+          <w:sz w:val="19"/>
+          <w:szCs w:val="19"/>
+        </w:rPr>
+        <w:t>using</w:t>
+      </w:r>
+      <w:proofErr w:type="spellEnd"/>
+      <w:r>
+        <w:rPr>
+          <w:sz w:val="19"/>
+          <w:szCs w:val="19"/>
+        </w:rPr>
+        <w:t xml:space="preserve"> </w:t>
+      </w:r>
+      <w:proofErr w:type="spellStart"/>
+      <w:r>
+        <w:rPr>
+          <w:sz w:val="19"/>
+          <w:szCs w:val="19"/>
+        </w:rPr>
+        <w:t>Siamese</w:t>
+      </w:r>
+      <w:proofErr w:type="spellEnd"/>
+      <w:r>
+        <w:rPr>
+          <w:sz w:val="19"/>
+          <w:szCs w:val="19"/>
+        </w:rPr>
+        <w:t xml:space="preserve"> BERT-Networks. </w:t>
+      </w:r>
+      <w:r>
+        <w:rPr>
+          <w:i/>
+          <w:iCs/>
+          <w:sz w:val="19"/>
+          <w:szCs w:val="19"/>
+        </w:rPr>
+        <w:t>EMNLP-IJCNLP 2019</w:t>
+      </w:r>
+      <w:r>
+        <w:rPr>
+          <w:sz w:val="19"/>
+          <w:szCs w:val="19"/>
+        </w:rPr>
+        <w:t>.</w:t>
+      </w:r>
+    </w:p>
+    <w:p>
+      <w:pPr>
+        <w:spacing w:after="90" w:line="260" w:lineRule="auto"/>
+        <w:ind w:left="360" w:hanging="360"/>
+      </w:pPr>
+      <w:r>
+        <w:rPr>
+          <w:sz w:val="19"/>
+          <w:szCs w:val="19"/>
+        </w:rPr>
+        <w:t xml:space="preserve">Reimers, N. et </w:t>
+      </w:r>
+      <w:proofErr w:type="spellStart"/>
+      <w:r>
+        <w:rPr>
+          <w:sz w:val="19"/>
+          <w:szCs w:val="19"/>
+        </w:rPr>
+        <w:t>Gurevych</w:t>
+      </w:r>
+      <w:proofErr w:type="spellEnd"/>
+      <w:r>
+        <w:rPr>
+          <w:sz w:val="19"/>
+          <w:szCs w:val="19"/>
+        </w:rPr>
+        <w:t xml:space="preserve">, I. (2020). </w:t>
+      </w:r>
+      <w:proofErr w:type="spellStart"/>
+      <w:r>
+        <w:rPr>
+          <w:sz w:val="19"/>
+          <w:szCs w:val="19"/>
+        </w:rPr>
+        <w:t>Making</w:t>
+      </w:r>
+      <w:proofErr w:type="spellEnd"/>
+      <w:r>
+        <w:rPr>
+          <w:sz w:val="19"/>
+          <w:szCs w:val="19"/>
+        </w:rPr>
+        <w:t xml:space="preserve"> </w:t>
+      </w:r>
+      <w:proofErr w:type="spellStart"/>
+      <w:r>
+        <w:rPr>
+          <w:sz w:val="19"/>
+          <w:szCs w:val="19"/>
+        </w:rPr>
+        <w:t>Monolingual</w:t>
+      </w:r>
+      <w:proofErr w:type="spellEnd"/>
+      <w:r>
+        <w:rPr>
+          <w:sz w:val="19"/>
+          <w:szCs w:val="19"/>
+        </w:rPr>
+        <w:t xml:space="preserve"> Sentence </w:t>
+      </w:r>
+      <w:proofErr w:type="spellStart"/>
+      <w:r>
+        <w:rPr>
+          <w:sz w:val="19"/>
+          <w:szCs w:val="19"/>
+        </w:rPr>
+        <w:t>Embeddings</w:t>
+      </w:r>
+      <w:proofErr w:type="spellEnd"/>
+      <w:r>
+        <w:rPr>
+          <w:sz w:val="19"/>
+          <w:szCs w:val="19"/>
+        </w:rPr>
+        <w:t xml:space="preserve"> </w:t>
+      </w:r>
+      <w:proofErr w:type="spellStart"/>
+      <w:r>
+        <w:rPr>
+          <w:sz w:val="19"/>
+          <w:szCs w:val="19"/>
+        </w:rPr>
+        <w:t>Multilingual</w:t>
+      </w:r>
+      <w:proofErr w:type="spellEnd"/>
+      <w:r>
+        <w:rPr>
+          <w:sz w:val="19"/>
+          <w:szCs w:val="19"/>
+        </w:rPr>
+        <w:t xml:space="preserve"> </w:t>
+      </w:r>
+      <w:proofErr w:type="spellStart"/>
+      <w:r>
+        <w:rPr>
+          <w:sz w:val="19"/>
+          <w:szCs w:val="19"/>
+        </w:rPr>
+        <w:t>using</w:t>
+      </w:r>
+      <w:proofErr w:type="spellEnd"/>
+      <w:r>
+        <w:rPr>
+          <w:sz w:val="19"/>
+          <w:szCs w:val="19"/>
+        </w:rPr>
+        <w:t xml:space="preserve"> </w:t>
+      </w:r>
+      <w:proofErr w:type="spellStart"/>
+      <w:r>
+        <w:rPr>
+          <w:sz w:val="19"/>
+          <w:szCs w:val="19"/>
+        </w:rPr>
+        <w:t>Knowledge</w:t>
+      </w:r>
+      <w:proofErr w:type="spellEnd"/>
+      <w:r>
+        <w:rPr>
+          <w:sz w:val="19"/>
+          <w:szCs w:val="19"/>
+        </w:rPr>
+        <w:t xml:space="preserve"> Distillation. </w:t>
+      </w:r>
+      <w:r>
+        <w:rPr>
+          <w:i/>
+          <w:iCs/>
+          <w:sz w:val="19"/>
+          <w:szCs w:val="19"/>
+        </w:rPr>
+        <w:t>EMNLP 2020</w:t>
+      </w:r>
+      <w:r>
+        <w:rPr>
+          <w:sz w:val="19"/>
+          <w:szCs w:val="19"/>
+        </w:rPr>
+        <w:t>.</w:t>
+      </w:r>
+    </w:p>
+    <w:p>
+      <w:pPr>
+        <w:spacing w:after="90" w:line="260" w:lineRule="auto"/>
+        <w:ind w:left="360" w:hanging="360"/>
+      </w:pPr>
+      <w:r>
+        <w:rPr>
+          <w:sz w:val="19"/>
+          <w:szCs w:val="19"/>
+        </w:rPr>
+        <w:t xml:space="preserve">Chandola, V., Banerjee, A. et Kumar, V. (2009). </w:t>
+      </w:r>
+      <w:proofErr w:type="spellStart"/>
+      <w:r>
+        <w:rPr>
+          <w:sz w:val="19"/>
+          <w:szCs w:val="19"/>
+        </w:rPr>
+        <w:t>Anomaly</w:t>
+      </w:r>
+      <w:proofErr w:type="spellEnd"/>
+      <w:r>
+        <w:rPr>
+          <w:sz w:val="19"/>
+          <w:szCs w:val="19"/>
+        </w:rPr>
+        <w:t xml:space="preserve"> </w:t>
+      </w:r>
+      <w:proofErr w:type="spellStart"/>
+      <w:proofErr w:type="gramStart"/>
+      <w:r>
+        <w:rPr>
+          <w:sz w:val="19"/>
+          <w:szCs w:val="19"/>
+        </w:rPr>
+        <w:t>detection</w:t>
+      </w:r>
+      <w:proofErr w:type="spellEnd"/>
+      <w:r>
+        <w:rPr>
+          <w:sz w:val="19"/>
+          <w:szCs w:val="19"/>
+        </w:rPr>
+        <w:t>:</w:t>
+      </w:r>
+      <w:proofErr w:type="gramEnd"/>
+      <w:r>
+        <w:rPr>
+          <w:sz w:val="19"/>
+          <w:szCs w:val="19"/>
+        </w:rPr>
+        <w:t xml:space="preserve"> A </w:t>
+      </w:r>
+      <w:proofErr w:type="spellStart"/>
+      <w:r>
+        <w:rPr>
+          <w:sz w:val="19"/>
+          <w:szCs w:val="19"/>
+        </w:rPr>
+        <w:t>survey</w:t>
+      </w:r>
+      <w:proofErr w:type="spellEnd"/>
+      <w:r>
+        <w:rPr>
+          <w:sz w:val="19"/>
+          <w:szCs w:val="19"/>
+        </w:rPr>
+        <w:t xml:space="preserve">. </w:t>
+      </w:r>
+      <w:r>
+        <w:rPr>
+          <w:i/>
+          <w:iCs/>
+          <w:sz w:val="19"/>
+          <w:szCs w:val="19"/>
+        </w:rPr>
+        <w:t xml:space="preserve">ACM </w:t>
+      </w:r>
+      <w:proofErr w:type="spellStart"/>
+      <w:r>
+        <w:rPr>
+          <w:i/>
+          <w:iCs/>
+          <w:sz w:val="19"/>
+          <w:szCs w:val="19"/>
+        </w:rPr>
+        <w:t>Computing</w:t>
+      </w:r>
+      <w:proofErr w:type="spellEnd"/>
+      <w:r>
+        <w:rPr>
+          <w:i/>
+          <w:iCs/>
+          <w:sz w:val="19"/>
+          <w:szCs w:val="19"/>
+        </w:rPr>
+        <w:t xml:space="preserve"> </w:t>
+      </w:r>
+      <w:proofErr w:type="spellStart"/>
+      <w:r>
+        <w:rPr>
+          <w:i/>
+          <w:iCs/>
+          <w:sz w:val="19"/>
+          <w:szCs w:val="19"/>
+        </w:rPr>
+        <w:t>Surveys</w:t>
+      </w:r>
+      <w:proofErr w:type="spellEnd"/>
+      <w:r>
+        <w:rPr>
+          <w:sz w:val="19"/>
+          <w:szCs w:val="19"/>
+        </w:rPr>
+        <w:t>, 41(3).</w:t>
+      </w:r>
+    </w:p>
+    <w:p>
+      <w:pPr>
+        <w:spacing w:after="90" w:line="260" w:lineRule="auto"/>
+        <w:ind w:left="360" w:hanging="360"/>
+      </w:pPr>
+      <w:proofErr w:type="spellStart"/>
+      <w:r>
+        <w:rPr>
+          <w:sz w:val="19"/>
+          <w:szCs w:val="19"/>
+        </w:rPr>
+        <w:t>Weisburd</w:t>
+      </w:r>
+      <w:proofErr w:type="spellEnd"/>
+      <w:r>
+        <w:rPr>
+          <w:sz w:val="19"/>
+          <w:szCs w:val="19"/>
+        </w:rPr>
+        <w:t xml:space="preserve">, D. (2015). The </w:t>
+      </w:r>
+      <w:proofErr w:type="spellStart"/>
+      <w:r>
+        <w:rPr>
+          <w:sz w:val="19"/>
+          <w:szCs w:val="19"/>
+        </w:rPr>
+        <w:t>law</w:t>
+      </w:r>
+      <w:proofErr w:type="spellEnd"/>
+      <w:r>
+        <w:rPr>
+          <w:sz w:val="19"/>
+          <w:szCs w:val="19"/>
+        </w:rPr>
+        <w:t xml:space="preserve"> of crime concentration and the </w:t>
+      </w:r>
+      <w:proofErr w:type="spellStart"/>
+      <w:r>
+        <w:rPr>
+          <w:sz w:val="19"/>
+          <w:szCs w:val="19"/>
+        </w:rPr>
+        <w:t>criminology</w:t>
+      </w:r>
+      <w:proofErr w:type="spellEnd"/>
+      <w:r>
+        <w:rPr>
+          <w:sz w:val="19"/>
+          <w:szCs w:val="19"/>
+        </w:rPr>
+        <w:t xml:space="preserve"> of place. </w:t>
+      </w:r>
+      <w:proofErr w:type="spellStart"/>
+      <w:r>
+        <w:rPr>
+          <w:i/>
+          <w:iCs/>
+          <w:sz w:val="19"/>
+          <w:szCs w:val="19"/>
+        </w:rPr>
+        <w:t>Criminology</w:t>
+      </w:r>
+      <w:proofErr w:type="spellEnd"/>
+      <w:r>
+        <w:rPr>
+          <w:sz w:val="19"/>
+          <w:szCs w:val="19"/>
+        </w:rPr>
+        <w:t>, 53(2), 133–157.</w:t>
+      </w:r>
+    </w:p>
+    <w:p>
+      <w:pPr>
+        <w:spacing w:after="90" w:line="260" w:lineRule="auto"/>
+        <w:ind w:left="360" w:hanging="360"/>
+      </w:pPr>
+      <w:r>
+        <w:rPr>
+          <w:sz w:val="19"/>
+          <w:szCs w:val="19"/>
+        </w:rPr>
+        <w:t xml:space="preserve">Lum, K. et Isaac, W. (2016). To </w:t>
+      </w:r>
+      <w:proofErr w:type="spellStart"/>
+      <w:r>
+        <w:rPr>
+          <w:sz w:val="19"/>
+          <w:szCs w:val="19"/>
+        </w:rPr>
+        <w:t>predict</w:t>
+      </w:r>
+      <w:proofErr w:type="spellEnd"/>
+      <w:r>
+        <w:rPr>
+          <w:sz w:val="19"/>
+          <w:szCs w:val="19"/>
+        </w:rPr>
+        <w:t xml:space="preserve"> and </w:t>
+      </w:r>
+      <w:proofErr w:type="gramStart"/>
+      <w:r>
+        <w:rPr>
+          <w:sz w:val="19"/>
+          <w:szCs w:val="19"/>
+        </w:rPr>
+        <w:t>serve?</w:t>
+      </w:r>
+      <w:proofErr w:type="gramEnd"/>
+      <w:r>
+        <w:rPr>
+          <w:sz w:val="19"/>
+          <w:szCs w:val="19"/>
+        </w:rPr>
+        <w:t xml:space="preserve"> </w:t>
+      </w:r>
+      <w:proofErr w:type="spellStart"/>
+      <w:r>
+        <w:rPr>
+          <w:i/>
+          <w:iCs/>
+          <w:sz w:val="19"/>
+          <w:szCs w:val="19"/>
+        </w:rPr>
         <w:t>Significance</w:t>
       </w:r>
+      <w:proofErr w:type="spellEnd"/>
       <w:r>
         <w:rPr>
           <w:sz w:val="19"/>
@@ -10749,7 +11837,15 @@
       </w:pPr>
       <w:bookmarkStart w:id="78" w:name="toc56"/>
       <w:r>
-        <w:t>Annexe C — Fiche de passation du mini-test humain</w:t>
+        <w:t xml:space="preserve">Annexe C — Fiche de passation du </w:t>
+      </w:r>
+      <w:proofErr w:type="spellStart"/>
+      <w:r>
+        <w:t>mini-test</w:t>
+      </w:r>
+      <w:proofErr w:type="spellEnd"/>
+      <w:r>
+        <w:t xml:space="preserve"> humain</w:t>
       </w:r>
       <w:bookmarkEnd w:id="78"/>
     </w:p>
@@ -10854,7 +11950,15 @@
         <w:spacing w:after="80" w:line="280" w:lineRule="auto"/>
       </w:pPr>
       <w:r>
-        <w:t>Demander : « Avez-vous compris pourquoi l'alerte est apparue ? » (oui / en partie / non).</w:t>
+        <w:t>Demander : « Avez-vous compris pourquoi l'alerte est apparue ? » (</w:t>
+      </w:r>
+      <w:proofErr w:type="gramStart"/>
+      <w:r>
+        <w:t>oui</w:t>
+      </w:r>
+      <w:proofErr w:type="gramEnd"/>
+      <w:r>
+        <w:t xml:space="preserve"> / en partie / non).</w:t>
       </w:r>
     </w:p>
     <w:p>
@@ -10993,7 +12097,15 @@
         <w:t>3 à 6 min : démonstration.</w:t>
       </w:r>
       <w:r>
-        <w:t xml:space="preserve"> Les trois scénarios : harcèlement, vandalisme avec carte, pass de sortie.</w:t>
+        <w:t xml:space="preserve"> Les trois scénarios : harcèlement, vandalisme avec carte, </w:t>
+      </w:r>
+      <w:proofErr w:type="spellStart"/>
+      <w:r>
+        <w:t>pass</w:t>
+      </w:r>
+      <w:proofErr w:type="spellEnd"/>
+      <w:r>
+        <w:t xml:space="preserve"> de sortie.</w:t>
       </w:r>
     </w:p>
     <w:p>
@@ -11193,6 +12305,7 @@
       <w:pPr>
         <w:spacing w:after="130"/>
       </w:pPr>
+      <w:proofErr w:type="spellStart"/>
       <w:r>
         <w:rPr>
           <w:b/>
@@ -11200,6 +12313,7 @@
         </w:rPr>
         <w:t>Embedding</w:t>
       </w:r>
+      <w:proofErr w:type="spellEnd"/>
       <w:r>
         <w:t xml:space="preserve"> : représentation d'une phrase par une suite de nombres, construite pour que des phrases de sens proche soient proches.</w:t>
       </w:r>
@@ -11421,6 +12535,8 @@
         <w:shd w:val="clear" w:color="auto" w:fill="F3F7FC"/>
         <w:ind w:left="200"/>
       </w:pPr>
+      <w:proofErr w:type="spellStart"/>
+      <w:proofErr w:type="gramStart"/>
       <w:r>
         <w:rPr>
           <w:rFonts w:ascii="Consolas" w:eastAsia="Consolas" w:hAnsi="Consolas" w:cs="Consolas"/>
@@ -11428,14 +12544,10 @@
           <w:sz w:val="18"/>
           <w:szCs w:val="18"/>
         </w:rPr>
-        <w:t>from sentence_transformers import SentenceTransformer, util</w:t>
-      </w:r>
-    </w:p>
-    <w:p>
-      <w:pPr>
-        <w:shd w:val="clear" w:color="auto" w:fill="F3F7FC"/>
-        <w:ind w:left="200"/>
-      </w:pPr>
+        <w:t>from</w:t>
+      </w:r>
+      <w:proofErr w:type="spellEnd"/>
+      <w:proofErr w:type="gramEnd"/>
       <w:r>
         <w:rPr>
           <w:rFonts w:ascii="Consolas" w:eastAsia="Consolas" w:hAnsi="Consolas" w:cs="Consolas"/>
@@ -11443,14 +12555,9 @@
           <w:sz w:val="18"/>
           <w:szCs w:val="18"/>
         </w:rPr>
-        <w:t>model = SentenceTransformer('paraphrase-multilingual-MiniLM-L12-v2')</w:t>
-      </w:r>
-    </w:p>
-    <w:p>
-      <w:pPr>
-        <w:shd w:val="clear" w:color="auto" w:fill="F3F7FC"/>
-        <w:ind w:left="200"/>
-      </w:pPr>
+        <w:t xml:space="preserve"> </w:t>
+      </w:r>
+      <w:proofErr w:type="spellStart"/>
       <w:r>
         <w:rPr>
           <w:rFonts w:ascii="Consolas" w:eastAsia="Consolas" w:hAnsi="Consolas" w:cs="Consolas"/>
@@ -11458,14 +12565,9 @@
           <w:sz w:val="18"/>
           <w:szCs w:val="18"/>
         </w:rPr>
-        <w:t>a = "On m'insulte souvent près du bâtiment B."</w:t>
-      </w:r>
-    </w:p>
-    <w:p>
-      <w:pPr>
-        <w:shd w:val="clear" w:color="auto" w:fill="F3F7FC"/>
-        <w:ind w:left="200"/>
-      </w:pPr>
+        <w:t>sentence_transformers</w:t>
+      </w:r>
+      <w:proofErr w:type="spellEnd"/>
       <w:r>
         <w:rPr>
           <w:rFonts w:ascii="Consolas" w:eastAsia="Consolas" w:hAnsi="Consolas" w:cs="Consolas"/>
@@ -11473,15 +12575,9 @@
           <w:sz w:val="18"/>
           <w:szCs w:val="18"/>
         </w:rPr>
-        <w:t>b = "Ils recommencent encore à la sortie."</w:t>
-      </w:r>
-    </w:p>
-    <w:p>
-      <w:pPr>
-        <w:shd w:val="clear" w:color="auto" w:fill="F3F7FC"/>
-        <w:spacing w:after="160"/>
-        <w:ind w:left="200"/>
-      </w:pPr>
+        <w:t xml:space="preserve"> import </w:t>
+      </w:r>
+      <w:proofErr w:type="spellStart"/>
       <w:r>
         <w:rPr>
           <w:rFonts w:ascii="Consolas" w:eastAsia="Consolas" w:hAnsi="Consolas" w:cs="Consolas"/>
@@ -11489,7 +12585,217 @@
           <w:sz w:val="18"/>
           <w:szCs w:val="18"/>
         </w:rPr>
-        <w:t>score = util.cos_sim(model.encode(a), model.encode(b))</w:t>
+        <w:t>SentenceTransformer</w:t>
+      </w:r>
+      <w:proofErr w:type="spellEnd"/>
+      <w:r>
+        <w:rPr>
+          <w:rFonts w:ascii="Consolas" w:eastAsia="Consolas" w:hAnsi="Consolas" w:cs="Consolas"/>
+          <w:color w:val="1B3A6B"/>
+          <w:sz w:val="18"/>
+          <w:szCs w:val="18"/>
+        </w:rPr>
+        <w:t xml:space="preserve">, </w:t>
+      </w:r>
+      <w:proofErr w:type="spellStart"/>
+      <w:r>
+        <w:rPr>
+          <w:rFonts w:ascii="Consolas" w:eastAsia="Consolas" w:hAnsi="Consolas" w:cs="Consolas"/>
+          <w:color w:val="1B3A6B"/>
+          <w:sz w:val="18"/>
+          <w:szCs w:val="18"/>
+        </w:rPr>
+        <w:t>util</w:t>
+      </w:r>
+      <w:proofErr w:type="spellEnd"/>
+    </w:p>
+    <w:p>
+      <w:pPr>
+        <w:shd w:val="clear" w:color="auto" w:fill="F3F7FC"/>
+        <w:ind w:left="200"/>
+      </w:pPr>
+      <w:proofErr w:type="gramStart"/>
+      <w:r>
+        <w:rPr>
+          <w:rFonts w:ascii="Consolas" w:eastAsia="Consolas" w:hAnsi="Consolas" w:cs="Consolas"/>
+          <w:color w:val="1B3A6B"/>
+          <w:sz w:val="18"/>
+          <w:szCs w:val="18"/>
+        </w:rPr>
+        <w:t>model</w:t>
+      </w:r>
+      <w:proofErr w:type="gramEnd"/>
+      <w:r>
+        <w:rPr>
+          <w:rFonts w:ascii="Consolas" w:eastAsia="Consolas" w:hAnsi="Consolas" w:cs="Consolas"/>
+          <w:color w:val="1B3A6B"/>
+          <w:sz w:val="18"/>
+          <w:szCs w:val="18"/>
+        </w:rPr>
+        <w:t xml:space="preserve"> = </w:t>
+      </w:r>
+      <w:proofErr w:type="spellStart"/>
+      <w:r>
+        <w:rPr>
+          <w:rFonts w:ascii="Consolas" w:eastAsia="Consolas" w:hAnsi="Consolas" w:cs="Consolas"/>
+          <w:color w:val="1B3A6B"/>
+          <w:sz w:val="18"/>
+          <w:szCs w:val="18"/>
+        </w:rPr>
+        <w:t>SentenceTransformer</w:t>
+      </w:r>
+      <w:proofErr w:type="spellEnd"/>
+      <w:r>
+        <w:rPr>
+          <w:rFonts w:ascii="Consolas" w:eastAsia="Consolas" w:hAnsi="Consolas" w:cs="Consolas"/>
+          <w:color w:val="1B3A6B"/>
+          <w:sz w:val="18"/>
+          <w:szCs w:val="18"/>
+        </w:rPr>
+        <w:t>('paraphrase-multilingual-MiniLM-L12-v2')</w:t>
+      </w:r>
+    </w:p>
+    <w:p>
+      <w:pPr>
+        <w:shd w:val="clear" w:color="auto" w:fill="F3F7FC"/>
+        <w:ind w:left="200"/>
+      </w:pPr>
+      <w:proofErr w:type="gramStart"/>
+      <w:r>
+        <w:rPr>
+          <w:rFonts w:ascii="Consolas" w:eastAsia="Consolas" w:hAnsi="Consolas" w:cs="Consolas"/>
+          <w:color w:val="1B3A6B"/>
+          <w:sz w:val="18"/>
+          <w:szCs w:val="18"/>
+        </w:rPr>
+        <w:t>a</w:t>
+      </w:r>
+      <w:proofErr w:type="gramEnd"/>
+      <w:r>
+        <w:rPr>
+          <w:rFonts w:ascii="Consolas" w:eastAsia="Consolas" w:hAnsi="Consolas" w:cs="Consolas"/>
+          <w:color w:val="1B3A6B"/>
+          <w:sz w:val="18"/>
+          <w:szCs w:val="18"/>
+        </w:rPr>
+        <w:t xml:space="preserve"> = "On m'insulte souvent près du bâtiment B."</w:t>
+      </w:r>
+    </w:p>
+    <w:p>
+      <w:pPr>
+        <w:shd w:val="clear" w:color="auto" w:fill="F3F7FC"/>
+        <w:ind w:left="200"/>
+      </w:pPr>
+      <w:proofErr w:type="gramStart"/>
+      <w:r>
+        <w:rPr>
+          <w:rFonts w:ascii="Consolas" w:eastAsia="Consolas" w:hAnsi="Consolas" w:cs="Consolas"/>
+          <w:color w:val="1B3A6B"/>
+          <w:sz w:val="18"/>
+          <w:szCs w:val="18"/>
+        </w:rPr>
+        <w:t>b</w:t>
+      </w:r>
+      <w:proofErr w:type="gramEnd"/>
+      <w:r>
+        <w:rPr>
+          <w:rFonts w:ascii="Consolas" w:eastAsia="Consolas" w:hAnsi="Consolas" w:cs="Consolas"/>
+          <w:color w:val="1B3A6B"/>
+          <w:sz w:val="18"/>
+          <w:szCs w:val="18"/>
+        </w:rPr>
+        <w:t xml:space="preserve"> = "Ils recommencent encore à la sortie."</w:t>
+      </w:r>
+    </w:p>
+    <w:p>
+      <w:pPr>
+        <w:shd w:val="clear" w:color="auto" w:fill="F3F7FC"/>
+        <w:spacing w:after="160"/>
+        <w:ind w:left="200"/>
+      </w:pPr>
+      <w:proofErr w:type="gramStart"/>
+      <w:r>
+        <w:rPr>
+          <w:rFonts w:ascii="Consolas" w:eastAsia="Consolas" w:hAnsi="Consolas" w:cs="Consolas"/>
+          <w:color w:val="1B3A6B"/>
+          <w:sz w:val="18"/>
+          <w:szCs w:val="18"/>
+        </w:rPr>
+        <w:t>score</w:t>
+      </w:r>
+      <w:proofErr w:type="gramEnd"/>
+      <w:r>
+        <w:rPr>
+          <w:rFonts w:ascii="Consolas" w:eastAsia="Consolas" w:hAnsi="Consolas" w:cs="Consolas"/>
+          <w:color w:val="1B3A6B"/>
+          <w:sz w:val="18"/>
+          <w:szCs w:val="18"/>
+        </w:rPr>
+        <w:t xml:space="preserve"> = </w:t>
+      </w:r>
+      <w:proofErr w:type="spellStart"/>
+      <w:r>
+        <w:rPr>
+          <w:rFonts w:ascii="Consolas" w:eastAsia="Consolas" w:hAnsi="Consolas" w:cs="Consolas"/>
+          <w:color w:val="1B3A6B"/>
+          <w:sz w:val="18"/>
+          <w:szCs w:val="18"/>
+        </w:rPr>
+        <w:t>util.cos_sim</w:t>
+      </w:r>
+      <w:proofErr w:type="spellEnd"/>
+      <w:r>
+        <w:rPr>
+          <w:rFonts w:ascii="Consolas" w:eastAsia="Consolas" w:hAnsi="Consolas" w:cs="Consolas"/>
+          <w:color w:val="1B3A6B"/>
+          <w:sz w:val="18"/>
+          <w:szCs w:val="18"/>
+        </w:rPr>
+        <w:t>(</w:t>
+      </w:r>
+      <w:proofErr w:type="spellStart"/>
+      <w:proofErr w:type="gramStart"/>
+      <w:r>
+        <w:rPr>
+          <w:rFonts w:ascii="Consolas" w:eastAsia="Consolas" w:hAnsi="Consolas" w:cs="Consolas"/>
+          <w:color w:val="1B3A6B"/>
+          <w:sz w:val="18"/>
+          <w:szCs w:val="18"/>
+        </w:rPr>
+        <w:t>model.encode</w:t>
+      </w:r>
+      <w:proofErr w:type="spellEnd"/>
+      <w:proofErr w:type="gramEnd"/>
+      <w:r>
+        <w:rPr>
+          <w:rFonts w:ascii="Consolas" w:eastAsia="Consolas" w:hAnsi="Consolas" w:cs="Consolas"/>
+          <w:color w:val="1B3A6B"/>
+          <w:sz w:val="18"/>
+          <w:szCs w:val="18"/>
+        </w:rPr>
+        <w:t xml:space="preserve">(a), </w:t>
+      </w:r>
+      <w:proofErr w:type="spellStart"/>
+      <w:proofErr w:type="gramStart"/>
+      <w:r>
+        <w:rPr>
+          <w:rFonts w:ascii="Consolas" w:eastAsia="Consolas" w:hAnsi="Consolas" w:cs="Consolas"/>
+          <w:color w:val="1B3A6B"/>
+          <w:sz w:val="18"/>
+          <w:szCs w:val="18"/>
+        </w:rPr>
+        <w:t>model.encode</w:t>
+      </w:r>
+      <w:proofErr w:type="spellEnd"/>
+      <w:proofErr w:type="gramEnd"/>
+      <w:r>
+        <w:rPr>
+          <w:rFonts w:ascii="Consolas" w:eastAsia="Consolas" w:hAnsi="Consolas" w:cs="Consolas"/>
+          <w:color w:val="1B3A6B"/>
+          <w:sz w:val="18"/>
+          <w:szCs w:val="18"/>
+        </w:rPr>
+        <w:t>(b))</w:t>
       </w:r>
     </w:p>
     <w:p>
@@ -11658,6 +12964,7 @@
         <w:tab w:val="right" w:pos="9638"/>
       </w:tabs>
     </w:pPr>
+    <w:proofErr w:type="gramStart"/>
     <w:r>
       <w:rPr>
         <w:b/>
@@ -11674,7 +12981,16 @@
         <w:sz w:val="16"/>
         <w:szCs w:val="16"/>
       </w:rPr>
-      <w:t xml:space="preserve">  ·  Système Intelligent de Prévention de la Délinquance en Milieu Scolaire</w:t>
+      <w:t xml:space="preserve">  ·</w:t>
+    </w:r>
+    <w:proofErr w:type="gramEnd"/>
+    <w:r>
+      <w:rPr>
+        <w:color w:val="5B6B82"/>
+        <w:sz w:val="16"/>
+        <w:szCs w:val="16"/>
+      </w:rPr>
+      <w:t xml:space="preserve">  Système Intelligent de Prévention de la Délinquance en Milieu Scolaire</w:t>
     </w:r>
     <w:r>
       <w:rPr>
@@ -11683,7 +12999,42 @@
         <w:szCs w:val="16"/>
       </w:rPr>
       <w:tab/>
-      <w:t>CAY  ·  Terminale C  ·  2026–2027</w:t>
+    </w:r>
+    <w:proofErr w:type="gramStart"/>
+    <w:r>
+      <w:rPr>
+        <w:color w:val="5B6B82"/>
+        <w:sz w:val="16"/>
+        <w:szCs w:val="16"/>
+      </w:rPr>
+      <w:t>CAY  ·</w:t>
+    </w:r>
+    <w:proofErr w:type="gramEnd"/>
+    <w:r>
+      <w:rPr>
+        <w:color w:val="5B6B82"/>
+        <w:sz w:val="16"/>
+        <w:szCs w:val="16"/>
+      </w:rPr>
+      <w:t xml:space="preserve">  Terminale </w:t>
+    </w:r>
+    <w:proofErr w:type="gramStart"/>
+    <w:r>
+      <w:rPr>
+        <w:color w:val="5B6B82"/>
+        <w:sz w:val="16"/>
+        <w:szCs w:val="16"/>
+      </w:rPr>
+      <w:t>C  ·</w:t>
+    </w:r>
+    <w:proofErr w:type="gramEnd"/>
+    <w:r>
+      <w:rPr>
+        <w:color w:val="5B6B82"/>
+        <w:sz w:val="16"/>
+        <w:szCs w:val="16"/>
+      </w:rPr>
+      <w:t xml:space="preserve">  2026–2027</w:t>
     </w:r>
   </w:p>
 </w:hdr>
@@ -12749,7 +14100,6 @@
   <w:style w:type="character" w:default="1" w:styleId="Policepardfaut">
     <w:name w:val="Default Paragraph Font"/>
     <w:uiPriority w:val="1"/>
-    <w:semiHidden/>
     <w:unhideWhenUsed/>
   </w:style>
   <w:style w:type="table" w:default="1" w:styleId="TableauNormal">

</xml_diff>